<commit_message>
fix(docs): embed Korean font in DOCX files
</commit_message>
<xml_diff>
--- a/docs/매매일지 기획 v0.1.docx
+++ b/docs/매매일지 기획 v0.1.docx
@@ -8,7 +8,7 @@
       </w:pPr>
       <w:r>
         <w:rPr>
-          <w:rFonts w:ascii="Noto Sans KR" w:hAnsi="Noto Sans KR" w:eastAsia="Noto Sans KR"/>
+          <w:rFonts w:ascii="NanumGothic" w:hAnsi="NanumGothic" w:eastAsia="NanumGothic" w:cs="NanumGothic"/>
           <w:b/>
           <w:color w:val="000000"/>
           <w:sz w:val="40"/>
@@ -22,7 +22,7 @@
       </w:pPr>
       <w:r>
         <w:rPr>
-          <w:rFonts w:ascii="Noto Sans KR" w:hAnsi="Noto Sans KR" w:eastAsia="Noto Sans KR"/>
+          <w:rFonts w:ascii="NanumGothic" w:hAnsi="NanumGothic" w:eastAsia="NanumGothic" w:cs="NanumGothic"/>
           <w:b w:val="0"/>
           <w:color w:val="666666"/>
           <w:sz w:val="22"/>
@@ -79,7 +79,7 @@
             </w:pPr>
             <w:r>
               <w:rPr>
-                <w:rFonts w:ascii="Noto Sans KR" w:hAnsi="Noto Sans KR" w:eastAsia="Noto Sans KR"/>
+                <w:rFonts w:ascii="NanumGothic" w:hAnsi="NanumGothic" w:eastAsia="NanumGothic" w:cs="NanumGothic"/>
                 <w:b/>
                 <w:color w:val="FFFFFF"/>
                 <w:sz w:val="18"/>
@@ -115,7 +115,7 @@
             </w:pPr>
             <w:r>
               <w:rPr>
-                <w:rFonts w:ascii="Noto Sans KR" w:hAnsi="Noto Sans KR" w:eastAsia="Noto Sans KR"/>
+                <w:rFonts w:ascii="NanumGothic" w:hAnsi="NanumGothic" w:eastAsia="NanumGothic" w:cs="NanumGothic"/>
                 <w:b/>
                 <w:color w:val="FFFFFF"/>
                 <w:sz w:val="18"/>
@@ -155,7 +155,7 @@
             </w:pPr>
             <w:r>
               <w:rPr>
-                <w:rFonts w:ascii="Noto Sans KR" w:hAnsi="Noto Sans KR" w:eastAsia="Noto Sans KR"/>
+                <w:rFonts w:ascii="NanumGothic" w:hAnsi="NanumGothic" w:eastAsia="NanumGothic" w:cs="NanumGothic"/>
                 <w:b w:val="0"/>
                 <w:color w:val="000000"/>
                 <w:sz w:val="18"/>
@@ -190,7 +190,7 @@
             </w:pPr>
             <w:r>
               <w:rPr>
-                <w:rFonts w:ascii="Noto Sans KR" w:hAnsi="Noto Sans KR" w:eastAsia="Noto Sans KR"/>
+                <w:rFonts w:ascii="NanumGothic" w:hAnsi="NanumGothic" w:eastAsia="NanumGothic" w:cs="NanumGothic"/>
                 <w:b w:val="0"/>
                 <w:color w:val="000000"/>
                 <w:sz w:val="18"/>
@@ -231,7 +231,7 @@
             </w:pPr>
             <w:r>
               <w:rPr>
-                <w:rFonts w:ascii="Noto Sans KR" w:hAnsi="Noto Sans KR" w:eastAsia="Noto Sans KR"/>
+                <w:rFonts w:ascii="NanumGothic" w:hAnsi="NanumGothic" w:eastAsia="NanumGothic" w:cs="NanumGothic"/>
                 <w:b w:val="0"/>
                 <w:color w:val="000000"/>
                 <w:sz w:val="18"/>
@@ -267,7 +267,7 @@
             </w:pPr>
             <w:r>
               <w:rPr>
-                <w:rFonts w:ascii="Noto Sans KR" w:hAnsi="Noto Sans KR" w:eastAsia="Noto Sans KR"/>
+                <w:rFonts w:ascii="NanumGothic" w:hAnsi="NanumGothic" w:eastAsia="NanumGothic" w:cs="NanumGothic"/>
                 <w:b w:val="0"/>
                 <w:color w:val="000000"/>
                 <w:sz w:val="18"/>
@@ -307,7 +307,7 @@
             </w:pPr>
             <w:r>
               <w:rPr>
-                <w:rFonts w:ascii="Noto Sans KR" w:hAnsi="Noto Sans KR" w:eastAsia="Noto Sans KR"/>
+                <w:rFonts w:ascii="NanumGothic" w:hAnsi="NanumGothic" w:eastAsia="NanumGothic" w:cs="NanumGothic"/>
                 <w:b w:val="0"/>
                 <w:color w:val="000000"/>
                 <w:sz w:val="18"/>
@@ -342,7 +342,7 @@
             </w:pPr>
             <w:r>
               <w:rPr>
-                <w:rFonts w:ascii="Noto Sans KR" w:hAnsi="Noto Sans KR" w:eastAsia="Noto Sans KR"/>
+                <w:rFonts w:ascii="NanumGothic" w:hAnsi="NanumGothic" w:eastAsia="NanumGothic" w:cs="NanumGothic"/>
                 <w:b w:val="0"/>
                 <w:color w:val="000000"/>
                 <w:sz w:val="18"/>
@@ -383,7 +383,7 @@
             </w:pPr>
             <w:r>
               <w:rPr>
-                <w:rFonts w:ascii="Noto Sans KR" w:hAnsi="Noto Sans KR" w:eastAsia="Noto Sans KR"/>
+                <w:rFonts w:ascii="NanumGothic" w:hAnsi="NanumGothic" w:eastAsia="NanumGothic" w:cs="NanumGothic"/>
                 <w:b w:val="0"/>
                 <w:color w:val="000000"/>
                 <w:sz w:val="18"/>
@@ -419,7 +419,7 @@
             </w:pPr>
             <w:r>
               <w:rPr>
-                <w:rFonts w:ascii="Noto Sans KR" w:hAnsi="Noto Sans KR" w:eastAsia="Noto Sans KR"/>
+                <w:rFonts w:ascii="NanumGothic" w:hAnsi="NanumGothic" w:eastAsia="NanumGothic" w:cs="NanumGothic"/>
                 <w:b w:val="0"/>
                 <w:color w:val="000000"/>
                 <w:sz w:val="18"/>
@@ -459,7 +459,7 @@
             </w:pPr>
             <w:r>
               <w:rPr>
-                <w:rFonts w:ascii="Noto Sans KR" w:hAnsi="Noto Sans KR" w:eastAsia="Noto Sans KR"/>
+                <w:rFonts w:ascii="NanumGothic" w:hAnsi="NanumGothic" w:eastAsia="NanumGothic" w:cs="NanumGothic"/>
                 <w:b w:val="0"/>
                 <w:color w:val="000000"/>
                 <w:sz w:val="18"/>
@@ -494,7 +494,7 @@
             </w:pPr>
             <w:r>
               <w:rPr>
-                <w:rFonts w:ascii="Noto Sans KR" w:hAnsi="Noto Sans KR" w:eastAsia="Noto Sans KR"/>
+                <w:rFonts w:ascii="NanumGothic" w:hAnsi="NanumGothic" w:eastAsia="NanumGothic" w:cs="NanumGothic"/>
                 <w:b w:val="0"/>
                 <w:color w:val="000000"/>
                 <w:sz w:val="18"/>
@@ -518,7 +518,7 @@
     <w:p>
       <w:r>
         <w:rPr>
-          <w:rFonts w:ascii="Noto Sans KR" w:hAnsi="Noto Sans KR" w:eastAsia="Noto Sans KR"/>
+          <w:rFonts w:ascii="NanumGothic" w:hAnsi="NanumGothic" w:eastAsia="NanumGothic" w:cs="NanumGothic"/>
           <w:b w:val="0"/>
           <w:color w:val="666666"/>
           <w:sz w:val="19"/>
@@ -547,7 +547,7 @@
       </w:pPr>
       <w:r>
         <w:rPr>
-          <w:rFonts w:ascii="Noto Sans KR" w:hAnsi="Noto Sans KR" w:eastAsia="Noto Sans KR"/>
+          <w:rFonts w:ascii="NanumGothic" w:hAnsi="NanumGothic" w:eastAsia="NanumGothic" w:cs="NanumGothic"/>
           <w:b w:val="0"/>
           <w:color w:val="000000"/>
           <w:sz w:val="21"/>
@@ -562,7 +562,7 @@
       </w:pPr>
       <w:r>
         <w:rPr>
-          <w:rFonts w:ascii="Noto Sans KR" w:hAnsi="Noto Sans KR" w:eastAsia="Noto Sans KR"/>
+          <w:rFonts w:ascii="NanumGothic" w:hAnsi="NanumGothic" w:eastAsia="NanumGothic" w:cs="NanumGothic"/>
           <w:b w:val="0"/>
           <w:color w:val="000000"/>
           <w:sz w:val="21"/>
@@ -623,7 +623,7 @@
             </w:pPr>
             <w:r>
               <w:rPr>
-                <w:rFonts w:ascii="Noto Sans KR" w:hAnsi="Noto Sans KR" w:eastAsia="Noto Sans KR"/>
+                <w:rFonts w:ascii="NanumGothic" w:hAnsi="NanumGothic" w:eastAsia="NanumGothic" w:cs="NanumGothic"/>
                 <w:b/>
                 <w:color w:val="FFFFFF"/>
                 <w:sz w:val="18"/>
@@ -659,7 +659,7 @@
             </w:pPr>
             <w:r>
               <w:rPr>
-                <w:rFonts w:ascii="Noto Sans KR" w:hAnsi="Noto Sans KR" w:eastAsia="Noto Sans KR"/>
+                <w:rFonts w:ascii="NanumGothic" w:hAnsi="NanumGothic" w:eastAsia="NanumGothic" w:cs="NanumGothic"/>
                 <w:b/>
                 <w:color w:val="FFFFFF"/>
                 <w:sz w:val="18"/>
@@ -699,7 +699,7 @@
             </w:pPr>
             <w:r>
               <w:rPr>
-                <w:rFonts w:ascii="Noto Sans KR" w:hAnsi="Noto Sans KR" w:eastAsia="Noto Sans KR"/>
+                <w:rFonts w:ascii="NanumGothic" w:hAnsi="NanumGothic" w:eastAsia="NanumGothic" w:cs="NanumGothic"/>
                 <w:b w:val="0"/>
                 <w:color w:val="000000"/>
                 <w:sz w:val="18"/>
@@ -734,7 +734,7 @@
             </w:pPr>
             <w:r>
               <w:rPr>
-                <w:rFonts w:ascii="Noto Sans KR" w:hAnsi="Noto Sans KR" w:eastAsia="Noto Sans KR"/>
+                <w:rFonts w:ascii="NanumGothic" w:hAnsi="NanumGothic" w:eastAsia="NanumGothic" w:cs="NanumGothic"/>
                 <w:b w:val="0"/>
                 <w:color w:val="000000"/>
                 <w:sz w:val="18"/>
@@ -775,7 +775,7 @@
             </w:pPr>
             <w:r>
               <w:rPr>
-                <w:rFonts w:ascii="Noto Sans KR" w:hAnsi="Noto Sans KR" w:eastAsia="Noto Sans KR"/>
+                <w:rFonts w:ascii="NanumGothic" w:hAnsi="NanumGothic" w:eastAsia="NanumGothic" w:cs="NanumGothic"/>
                 <w:b w:val="0"/>
                 <w:color w:val="000000"/>
                 <w:sz w:val="18"/>
@@ -811,7 +811,7 @@
             </w:pPr>
             <w:r>
               <w:rPr>
-                <w:rFonts w:ascii="Noto Sans KR" w:hAnsi="Noto Sans KR" w:eastAsia="Noto Sans KR"/>
+                <w:rFonts w:ascii="NanumGothic" w:hAnsi="NanumGothic" w:eastAsia="NanumGothic" w:cs="NanumGothic"/>
                 <w:b w:val="0"/>
                 <w:color w:val="000000"/>
                 <w:sz w:val="18"/>
@@ -851,7 +851,7 @@
             </w:pPr>
             <w:r>
               <w:rPr>
-                <w:rFonts w:ascii="Noto Sans KR" w:hAnsi="Noto Sans KR" w:eastAsia="Noto Sans KR"/>
+                <w:rFonts w:ascii="NanumGothic" w:hAnsi="NanumGothic" w:eastAsia="NanumGothic" w:cs="NanumGothic"/>
                 <w:b w:val="0"/>
                 <w:color w:val="000000"/>
                 <w:sz w:val="18"/>
@@ -886,7 +886,7 @@
             </w:pPr>
             <w:r>
               <w:rPr>
-                <w:rFonts w:ascii="Noto Sans KR" w:hAnsi="Noto Sans KR" w:eastAsia="Noto Sans KR"/>
+                <w:rFonts w:ascii="NanumGothic" w:hAnsi="NanumGothic" w:eastAsia="NanumGothic" w:cs="NanumGothic"/>
                 <w:b w:val="0"/>
                 <w:color w:val="000000"/>
                 <w:sz w:val="18"/>
@@ -927,7 +927,7 @@
             </w:pPr>
             <w:r>
               <w:rPr>
-                <w:rFonts w:ascii="Noto Sans KR" w:hAnsi="Noto Sans KR" w:eastAsia="Noto Sans KR"/>
+                <w:rFonts w:ascii="NanumGothic" w:hAnsi="NanumGothic" w:eastAsia="NanumGothic" w:cs="NanumGothic"/>
                 <w:b w:val="0"/>
                 <w:color w:val="000000"/>
                 <w:sz w:val="18"/>
@@ -963,7 +963,7 @@
             </w:pPr>
             <w:r>
               <w:rPr>
-                <w:rFonts w:ascii="Noto Sans KR" w:hAnsi="Noto Sans KR" w:eastAsia="Noto Sans KR"/>
+                <w:rFonts w:ascii="NanumGothic" w:hAnsi="NanumGothic" w:eastAsia="NanumGothic" w:cs="NanumGothic"/>
                 <w:b w:val="0"/>
                 <w:color w:val="000000"/>
                 <w:sz w:val="18"/>
@@ -1003,7 +1003,7 @@
             </w:pPr>
             <w:r>
               <w:rPr>
-                <w:rFonts w:ascii="Noto Sans KR" w:hAnsi="Noto Sans KR" w:eastAsia="Noto Sans KR"/>
+                <w:rFonts w:ascii="NanumGothic" w:hAnsi="NanumGothic" w:eastAsia="NanumGothic" w:cs="NanumGothic"/>
                 <w:b w:val="0"/>
                 <w:color w:val="000000"/>
                 <w:sz w:val="18"/>
@@ -1038,7 +1038,7 @@
             </w:pPr>
             <w:r>
               <w:rPr>
-                <w:rFonts w:ascii="Noto Sans KR" w:hAnsi="Noto Sans KR" w:eastAsia="Noto Sans KR"/>
+                <w:rFonts w:ascii="NanumGothic" w:hAnsi="NanumGothic" w:eastAsia="NanumGothic" w:cs="NanumGothic"/>
                 <w:b w:val="0"/>
                 <w:color w:val="000000"/>
                 <w:sz w:val="18"/>
@@ -1071,7 +1071,7 @@
       </w:pPr>
       <w:r>
         <w:rPr>
-          <w:rFonts w:ascii="Noto Sans KR" w:hAnsi="Noto Sans KR" w:eastAsia="Noto Sans KR"/>
+          <w:rFonts w:ascii="NanumGothic" w:hAnsi="NanumGothic" w:eastAsia="NanumGothic" w:cs="NanumGothic"/>
           <w:b w:val="0"/>
           <w:color w:val="000000"/>
           <w:sz w:val="21"/>
@@ -1087,7 +1087,7 @@
       </w:pPr>
       <w:r>
         <w:rPr>
-          <w:rFonts w:ascii="Noto Sans KR" w:hAnsi="Noto Sans KR" w:eastAsia="Noto Sans KR"/>
+          <w:rFonts w:ascii="NanumGothic" w:hAnsi="NanumGothic" w:eastAsia="NanumGothic" w:cs="NanumGothic"/>
           <w:b w:val="0"/>
           <w:color w:val="000000"/>
           <w:sz w:val="21"/>
@@ -1103,7 +1103,7 @@
       </w:pPr>
       <w:r>
         <w:rPr>
-          <w:rFonts w:ascii="Noto Sans KR" w:hAnsi="Noto Sans KR" w:eastAsia="Noto Sans KR"/>
+          <w:rFonts w:ascii="NanumGothic" w:hAnsi="NanumGothic" w:eastAsia="NanumGothic" w:cs="NanumGothic"/>
           <w:b w:val="0"/>
           <w:color w:val="000000"/>
           <w:sz w:val="21"/>
@@ -1119,7 +1119,7 @@
       </w:pPr>
       <w:r>
         <w:rPr>
-          <w:rFonts w:ascii="Noto Sans KR" w:hAnsi="Noto Sans KR" w:eastAsia="Noto Sans KR"/>
+          <w:rFonts w:ascii="NanumGothic" w:hAnsi="NanumGothic" w:eastAsia="NanumGothic" w:cs="NanumGothic"/>
           <w:b w:val="0"/>
           <w:color w:val="000000"/>
           <w:sz w:val="21"/>
@@ -1135,7 +1135,7 @@
       </w:pPr>
       <w:r>
         <w:rPr>
-          <w:rFonts w:ascii="Noto Sans KR" w:hAnsi="Noto Sans KR" w:eastAsia="Noto Sans KR"/>
+          <w:rFonts w:ascii="NanumGothic" w:hAnsi="NanumGothic" w:eastAsia="NanumGothic" w:cs="NanumGothic"/>
           <w:b w:val="0"/>
           <w:color w:val="000000"/>
           <w:sz w:val="21"/>
@@ -1196,7 +1196,7 @@
             </w:pPr>
             <w:r>
               <w:rPr>
-                <w:rFonts w:ascii="Noto Sans KR" w:hAnsi="Noto Sans KR" w:eastAsia="Noto Sans KR"/>
+                <w:rFonts w:ascii="NanumGothic" w:hAnsi="NanumGothic" w:eastAsia="NanumGothic" w:cs="NanumGothic"/>
                 <w:b/>
                 <w:color w:val="FFFFFF"/>
                 <w:sz w:val="18"/>
@@ -1232,7 +1232,7 @@
             </w:pPr>
             <w:r>
               <w:rPr>
-                <w:rFonts w:ascii="Noto Sans KR" w:hAnsi="Noto Sans KR" w:eastAsia="Noto Sans KR"/>
+                <w:rFonts w:ascii="NanumGothic" w:hAnsi="NanumGothic" w:eastAsia="NanumGothic" w:cs="NanumGothic"/>
                 <w:b/>
                 <w:color w:val="FFFFFF"/>
                 <w:sz w:val="18"/>
@@ -1272,7 +1272,7 @@
             </w:pPr>
             <w:r>
               <w:rPr>
-                <w:rFonts w:ascii="Noto Sans KR" w:hAnsi="Noto Sans KR" w:eastAsia="Noto Sans KR"/>
+                <w:rFonts w:ascii="NanumGothic" w:hAnsi="NanumGothic" w:eastAsia="NanumGothic" w:cs="NanumGothic"/>
                 <w:b w:val="0"/>
                 <w:color w:val="000000"/>
                 <w:sz w:val="18"/>
@@ -1307,7 +1307,7 @@
             </w:pPr>
             <w:r>
               <w:rPr>
-                <w:rFonts w:ascii="Noto Sans KR" w:hAnsi="Noto Sans KR" w:eastAsia="Noto Sans KR"/>
+                <w:rFonts w:ascii="NanumGothic" w:hAnsi="NanumGothic" w:eastAsia="NanumGothic" w:cs="NanumGothic"/>
                 <w:b w:val="0"/>
                 <w:color w:val="000000"/>
                 <w:sz w:val="18"/>
@@ -1348,7 +1348,7 @@
             </w:pPr>
             <w:r>
               <w:rPr>
-                <w:rFonts w:ascii="Noto Sans KR" w:hAnsi="Noto Sans KR" w:eastAsia="Noto Sans KR"/>
+                <w:rFonts w:ascii="NanumGothic" w:hAnsi="NanumGothic" w:eastAsia="NanumGothic" w:cs="NanumGothic"/>
                 <w:b w:val="0"/>
                 <w:color w:val="000000"/>
                 <w:sz w:val="18"/>
@@ -1384,7 +1384,7 @@
             </w:pPr>
             <w:r>
               <w:rPr>
-                <w:rFonts w:ascii="Noto Sans KR" w:hAnsi="Noto Sans KR" w:eastAsia="Noto Sans KR"/>
+                <w:rFonts w:ascii="NanumGothic" w:hAnsi="NanumGothic" w:eastAsia="NanumGothic" w:cs="NanumGothic"/>
                 <w:b w:val="0"/>
                 <w:color w:val="000000"/>
                 <w:sz w:val="18"/>
@@ -1424,7 +1424,7 @@
             </w:pPr>
             <w:r>
               <w:rPr>
-                <w:rFonts w:ascii="Noto Sans KR" w:hAnsi="Noto Sans KR" w:eastAsia="Noto Sans KR"/>
+                <w:rFonts w:ascii="NanumGothic" w:hAnsi="NanumGothic" w:eastAsia="NanumGothic" w:cs="NanumGothic"/>
                 <w:b w:val="0"/>
                 <w:color w:val="000000"/>
                 <w:sz w:val="18"/>
@@ -1459,7 +1459,7 @@
             </w:pPr>
             <w:r>
               <w:rPr>
-                <w:rFonts w:ascii="Noto Sans KR" w:hAnsi="Noto Sans KR" w:eastAsia="Noto Sans KR"/>
+                <w:rFonts w:ascii="NanumGothic" w:hAnsi="NanumGothic" w:eastAsia="NanumGothic" w:cs="NanumGothic"/>
                 <w:b w:val="0"/>
                 <w:color w:val="000000"/>
                 <w:sz w:val="18"/>
@@ -1500,7 +1500,7 @@
             </w:pPr>
             <w:r>
               <w:rPr>
-                <w:rFonts w:ascii="Noto Sans KR" w:hAnsi="Noto Sans KR" w:eastAsia="Noto Sans KR"/>
+                <w:rFonts w:ascii="NanumGothic" w:hAnsi="NanumGothic" w:eastAsia="NanumGothic" w:cs="NanumGothic"/>
                 <w:b w:val="0"/>
                 <w:color w:val="000000"/>
                 <w:sz w:val="18"/>
@@ -1536,7 +1536,7 @@
             </w:pPr>
             <w:r>
               <w:rPr>
-                <w:rFonts w:ascii="Noto Sans KR" w:hAnsi="Noto Sans KR" w:eastAsia="Noto Sans KR"/>
+                <w:rFonts w:ascii="NanumGothic" w:hAnsi="NanumGothic" w:eastAsia="NanumGothic" w:cs="NanumGothic"/>
                 <w:b w:val="0"/>
                 <w:color w:val="000000"/>
                 <w:sz w:val="18"/>
@@ -1578,7 +1578,7 @@
       </w:pPr>
       <w:r>
         <w:rPr>
-          <w:rFonts w:ascii="Noto Sans KR" w:hAnsi="Noto Sans KR" w:eastAsia="Noto Sans KR"/>
+          <w:rFonts w:ascii="NanumGothic" w:hAnsi="NanumGothic" w:eastAsia="NanumGothic" w:cs="NanumGothic"/>
           <w:b w:val="0"/>
           <w:color w:val="000000"/>
           <w:sz w:val="19"/>
@@ -1594,7 +1594,7 @@
       </w:pPr>
       <w:r>
         <w:rPr>
-          <w:rFonts w:ascii="Noto Sans KR" w:hAnsi="Noto Sans KR" w:eastAsia="Noto Sans KR"/>
+          <w:rFonts w:ascii="NanumGothic" w:hAnsi="NanumGothic" w:eastAsia="NanumGothic" w:cs="NanumGothic"/>
           <w:b w:val="0"/>
           <w:color w:val="000000"/>
           <w:sz w:val="19"/>
@@ -1610,7 +1610,7 @@
       </w:pPr>
       <w:r>
         <w:rPr>
-          <w:rFonts w:ascii="Noto Sans KR" w:hAnsi="Noto Sans KR" w:eastAsia="Noto Sans KR"/>
+          <w:rFonts w:ascii="NanumGothic" w:hAnsi="NanumGothic" w:eastAsia="NanumGothic" w:cs="NanumGothic"/>
           <w:b w:val="0"/>
           <w:color w:val="000000"/>
           <w:sz w:val="19"/>
@@ -1635,7 +1635,7 @@
       </w:pPr>
       <w:r>
         <w:rPr>
-          <w:rFonts w:ascii="Noto Sans KR" w:hAnsi="Noto Sans KR" w:eastAsia="Noto Sans KR"/>
+          <w:rFonts w:ascii="NanumGothic" w:hAnsi="NanumGothic" w:eastAsia="NanumGothic" w:cs="NanumGothic"/>
           <w:b w:val="0"/>
           <w:color w:val="000000"/>
           <w:sz w:val="19"/>
@@ -1651,7 +1651,7 @@
       </w:pPr>
       <w:r>
         <w:rPr>
-          <w:rFonts w:ascii="Noto Sans KR" w:hAnsi="Noto Sans KR" w:eastAsia="Noto Sans KR"/>
+          <w:rFonts w:ascii="NanumGothic" w:hAnsi="NanumGothic" w:eastAsia="NanumGothic" w:cs="NanumGothic"/>
           <w:b w:val="0"/>
           <w:color w:val="000000"/>
           <w:sz w:val="19"/>
@@ -1667,7 +1667,7 @@
       </w:pPr>
       <w:r>
         <w:rPr>
-          <w:rFonts w:ascii="Noto Sans KR" w:hAnsi="Noto Sans KR" w:eastAsia="Noto Sans KR"/>
+          <w:rFonts w:ascii="NanumGothic" w:hAnsi="NanumGothic" w:eastAsia="NanumGothic" w:cs="NanumGothic"/>
           <w:b w:val="0"/>
           <w:color w:val="000000"/>
           <w:sz w:val="19"/>
@@ -1683,7 +1683,7 @@
       </w:pPr>
       <w:r>
         <w:rPr>
-          <w:rFonts w:ascii="Noto Sans KR" w:hAnsi="Noto Sans KR" w:eastAsia="Noto Sans KR"/>
+          <w:rFonts w:ascii="NanumGothic" w:hAnsi="NanumGothic" w:eastAsia="NanumGothic" w:cs="NanumGothic"/>
           <w:b w:val="0"/>
           <w:color w:val="000000"/>
           <w:sz w:val="19"/>
@@ -1699,7 +1699,7 @@
       </w:pPr>
       <w:r>
         <w:rPr>
-          <w:rFonts w:ascii="Noto Sans KR" w:hAnsi="Noto Sans KR" w:eastAsia="Noto Sans KR"/>
+          <w:rFonts w:ascii="NanumGothic" w:hAnsi="NanumGothic" w:eastAsia="NanumGothic" w:cs="NanumGothic"/>
           <w:b w:val="0"/>
           <w:color w:val="000000"/>
           <w:sz w:val="19"/>
@@ -1761,7 +1761,7 @@
             </w:pPr>
             <w:r>
               <w:rPr>
-                <w:rFonts w:ascii="Noto Sans KR" w:hAnsi="Noto Sans KR" w:eastAsia="Noto Sans KR"/>
+                <w:rFonts w:ascii="NanumGothic" w:hAnsi="NanumGothic" w:eastAsia="NanumGothic" w:cs="NanumGothic"/>
                 <w:b/>
                 <w:color w:val="FFFFFF"/>
                 <w:sz w:val="18"/>
@@ -1797,7 +1797,7 @@
             </w:pPr>
             <w:r>
               <w:rPr>
-                <w:rFonts w:ascii="Noto Sans KR" w:hAnsi="Noto Sans KR" w:eastAsia="Noto Sans KR"/>
+                <w:rFonts w:ascii="NanumGothic" w:hAnsi="NanumGothic" w:eastAsia="NanumGothic" w:cs="NanumGothic"/>
                 <w:b/>
                 <w:color w:val="FFFFFF"/>
                 <w:sz w:val="18"/>
@@ -1833,7 +1833,7 @@
             </w:pPr>
             <w:r>
               <w:rPr>
-                <w:rFonts w:ascii="Noto Sans KR" w:hAnsi="Noto Sans KR" w:eastAsia="Noto Sans KR"/>
+                <w:rFonts w:ascii="NanumGothic" w:hAnsi="NanumGothic" w:eastAsia="NanumGothic" w:cs="NanumGothic"/>
                 <w:b/>
                 <w:color w:val="FFFFFF"/>
                 <w:sz w:val="18"/>
@@ -1873,7 +1873,7 @@
             </w:pPr>
             <w:r>
               <w:rPr>
-                <w:rFonts w:ascii="Noto Sans KR" w:hAnsi="Noto Sans KR" w:eastAsia="Noto Sans KR"/>
+                <w:rFonts w:ascii="NanumGothic" w:hAnsi="NanumGothic" w:eastAsia="NanumGothic" w:cs="NanumGothic"/>
                 <w:b w:val="0"/>
                 <w:color w:val="000000"/>
                 <w:sz w:val="18"/>
@@ -1908,7 +1908,7 @@
             </w:pPr>
             <w:r>
               <w:rPr>
-                <w:rFonts w:ascii="Noto Sans KR" w:hAnsi="Noto Sans KR" w:eastAsia="Noto Sans KR"/>
+                <w:rFonts w:ascii="NanumGothic" w:hAnsi="NanumGothic" w:eastAsia="NanumGothic" w:cs="NanumGothic"/>
                 <w:b w:val="0"/>
                 <w:color w:val="000000"/>
                 <w:sz w:val="18"/>
@@ -1943,7 +1943,7 @@
             </w:pPr>
             <w:r>
               <w:rPr>
-                <w:rFonts w:ascii="Noto Sans KR" w:hAnsi="Noto Sans KR" w:eastAsia="Noto Sans KR"/>
+                <w:rFonts w:ascii="NanumGothic" w:hAnsi="NanumGothic" w:eastAsia="NanumGothic" w:cs="NanumGothic"/>
                 <w:b w:val="0"/>
                 <w:color w:val="000000"/>
                 <w:sz w:val="18"/>
@@ -1984,7 +1984,7 @@
             </w:pPr>
             <w:r>
               <w:rPr>
-                <w:rFonts w:ascii="Noto Sans KR" w:hAnsi="Noto Sans KR" w:eastAsia="Noto Sans KR"/>
+                <w:rFonts w:ascii="NanumGothic" w:hAnsi="NanumGothic" w:eastAsia="NanumGothic" w:cs="NanumGothic"/>
                 <w:b w:val="0"/>
                 <w:color w:val="000000"/>
                 <w:sz w:val="18"/>
@@ -2020,7 +2020,7 @@
             </w:pPr>
             <w:r>
               <w:rPr>
-                <w:rFonts w:ascii="Noto Sans KR" w:hAnsi="Noto Sans KR" w:eastAsia="Noto Sans KR"/>
+                <w:rFonts w:ascii="NanumGothic" w:hAnsi="NanumGothic" w:eastAsia="NanumGothic" w:cs="NanumGothic"/>
                 <w:b w:val="0"/>
                 <w:color w:val="000000"/>
                 <w:sz w:val="18"/>
@@ -2056,7 +2056,7 @@
             </w:pPr>
             <w:r>
               <w:rPr>
-                <w:rFonts w:ascii="Noto Sans KR" w:hAnsi="Noto Sans KR" w:eastAsia="Noto Sans KR"/>
+                <w:rFonts w:ascii="NanumGothic" w:hAnsi="NanumGothic" w:eastAsia="NanumGothic" w:cs="NanumGothic"/>
                 <w:b w:val="0"/>
                 <w:color w:val="000000"/>
                 <w:sz w:val="18"/>
@@ -2096,7 +2096,7 @@
             </w:pPr>
             <w:r>
               <w:rPr>
-                <w:rFonts w:ascii="Noto Sans KR" w:hAnsi="Noto Sans KR" w:eastAsia="Noto Sans KR"/>
+                <w:rFonts w:ascii="NanumGothic" w:hAnsi="NanumGothic" w:eastAsia="NanumGothic" w:cs="NanumGothic"/>
                 <w:b w:val="0"/>
                 <w:color w:val="000000"/>
                 <w:sz w:val="18"/>
@@ -2131,7 +2131,7 @@
             </w:pPr>
             <w:r>
               <w:rPr>
-                <w:rFonts w:ascii="Noto Sans KR" w:hAnsi="Noto Sans KR" w:eastAsia="Noto Sans KR"/>
+                <w:rFonts w:ascii="NanumGothic" w:hAnsi="NanumGothic" w:eastAsia="NanumGothic" w:cs="NanumGothic"/>
                 <w:b w:val="0"/>
                 <w:color w:val="000000"/>
                 <w:sz w:val="18"/>
@@ -2166,7 +2166,7 @@
             </w:pPr>
             <w:r>
               <w:rPr>
-                <w:rFonts w:ascii="Noto Sans KR" w:hAnsi="Noto Sans KR" w:eastAsia="Noto Sans KR"/>
+                <w:rFonts w:ascii="NanumGothic" w:hAnsi="NanumGothic" w:eastAsia="NanumGothic" w:cs="NanumGothic"/>
                 <w:b w:val="0"/>
                 <w:color w:val="000000"/>
                 <w:sz w:val="18"/>
@@ -2207,7 +2207,7 @@
             </w:pPr>
             <w:r>
               <w:rPr>
-                <w:rFonts w:ascii="Noto Sans KR" w:hAnsi="Noto Sans KR" w:eastAsia="Noto Sans KR"/>
+                <w:rFonts w:ascii="NanumGothic" w:hAnsi="NanumGothic" w:eastAsia="NanumGothic" w:cs="NanumGothic"/>
                 <w:b w:val="0"/>
                 <w:color w:val="000000"/>
                 <w:sz w:val="18"/>
@@ -2243,7 +2243,7 @@
             </w:pPr>
             <w:r>
               <w:rPr>
-                <w:rFonts w:ascii="Noto Sans KR" w:hAnsi="Noto Sans KR" w:eastAsia="Noto Sans KR"/>
+                <w:rFonts w:ascii="NanumGothic" w:hAnsi="NanumGothic" w:eastAsia="NanumGothic" w:cs="NanumGothic"/>
                 <w:b w:val="0"/>
                 <w:color w:val="000000"/>
                 <w:sz w:val="18"/>
@@ -2279,7 +2279,7 @@
             </w:pPr>
             <w:r>
               <w:rPr>
-                <w:rFonts w:ascii="Noto Sans KR" w:hAnsi="Noto Sans KR" w:eastAsia="Noto Sans KR"/>
+                <w:rFonts w:ascii="NanumGothic" w:hAnsi="NanumGothic" w:eastAsia="NanumGothic" w:cs="NanumGothic"/>
                 <w:b w:val="0"/>
                 <w:color w:val="000000"/>
                 <w:sz w:val="18"/>
@@ -2319,7 +2319,7 @@
             </w:pPr>
             <w:r>
               <w:rPr>
-                <w:rFonts w:ascii="Noto Sans KR" w:hAnsi="Noto Sans KR" w:eastAsia="Noto Sans KR"/>
+                <w:rFonts w:ascii="NanumGothic" w:hAnsi="NanumGothic" w:eastAsia="NanumGothic" w:cs="NanumGothic"/>
                 <w:b w:val="0"/>
                 <w:color w:val="000000"/>
                 <w:sz w:val="18"/>
@@ -2354,7 +2354,7 @@
             </w:pPr>
             <w:r>
               <w:rPr>
-                <w:rFonts w:ascii="Noto Sans KR" w:hAnsi="Noto Sans KR" w:eastAsia="Noto Sans KR"/>
+                <w:rFonts w:ascii="NanumGothic" w:hAnsi="NanumGothic" w:eastAsia="NanumGothic" w:cs="NanumGothic"/>
                 <w:b w:val="0"/>
                 <w:color w:val="000000"/>
                 <w:sz w:val="18"/>
@@ -2389,7 +2389,7 @@
             </w:pPr>
             <w:r>
               <w:rPr>
-                <w:rFonts w:ascii="Noto Sans KR" w:hAnsi="Noto Sans KR" w:eastAsia="Noto Sans KR"/>
+                <w:rFonts w:ascii="NanumGothic" w:hAnsi="NanumGothic" w:eastAsia="NanumGothic" w:cs="NanumGothic"/>
                 <w:b w:val="0"/>
                 <w:color w:val="000000"/>
                 <w:sz w:val="18"/>
@@ -2430,7 +2430,7 @@
             </w:pPr>
             <w:r>
               <w:rPr>
-                <w:rFonts w:ascii="Noto Sans KR" w:hAnsi="Noto Sans KR" w:eastAsia="Noto Sans KR"/>
+                <w:rFonts w:ascii="NanumGothic" w:hAnsi="NanumGothic" w:eastAsia="NanumGothic" w:cs="NanumGothic"/>
                 <w:b w:val="0"/>
                 <w:color w:val="000000"/>
                 <w:sz w:val="18"/>
@@ -2466,7 +2466,7 @@
             </w:pPr>
             <w:r>
               <w:rPr>
-                <w:rFonts w:ascii="Noto Sans KR" w:hAnsi="Noto Sans KR" w:eastAsia="Noto Sans KR"/>
+                <w:rFonts w:ascii="NanumGothic" w:hAnsi="NanumGothic" w:eastAsia="NanumGothic" w:cs="NanumGothic"/>
                 <w:b w:val="0"/>
                 <w:color w:val="000000"/>
                 <w:sz w:val="18"/>
@@ -2502,7 +2502,7 @@
             </w:pPr>
             <w:r>
               <w:rPr>
-                <w:rFonts w:ascii="Noto Sans KR" w:hAnsi="Noto Sans KR" w:eastAsia="Noto Sans KR"/>
+                <w:rFonts w:ascii="NanumGothic" w:hAnsi="NanumGothic" w:eastAsia="NanumGothic" w:cs="NanumGothic"/>
                 <w:b w:val="0"/>
                 <w:color w:val="000000"/>
                 <w:sz w:val="18"/>
@@ -2542,7 +2542,7 @@
             </w:pPr>
             <w:r>
               <w:rPr>
-                <w:rFonts w:ascii="Noto Sans KR" w:hAnsi="Noto Sans KR" w:eastAsia="Noto Sans KR"/>
+                <w:rFonts w:ascii="NanumGothic" w:hAnsi="NanumGothic" w:eastAsia="NanumGothic" w:cs="NanumGothic"/>
                 <w:b w:val="0"/>
                 <w:color w:val="000000"/>
                 <w:sz w:val="18"/>
@@ -2577,7 +2577,7 @@
             </w:pPr>
             <w:r>
               <w:rPr>
-                <w:rFonts w:ascii="Noto Sans KR" w:hAnsi="Noto Sans KR" w:eastAsia="Noto Sans KR"/>
+                <w:rFonts w:ascii="NanumGothic" w:hAnsi="NanumGothic" w:eastAsia="NanumGothic" w:cs="NanumGothic"/>
                 <w:b w:val="0"/>
                 <w:color w:val="000000"/>
                 <w:sz w:val="18"/>
@@ -2612,7 +2612,7 @@
             </w:pPr>
             <w:r>
               <w:rPr>
-                <w:rFonts w:ascii="Noto Sans KR" w:hAnsi="Noto Sans KR" w:eastAsia="Noto Sans KR"/>
+                <w:rFonts w:ascii="NanumGothic" w:hAnsi="NanumGothic" w:eastAsia="NanumGothic" w:cs="NanumGothic"/>
                 <w:b w:val="0"/>
                 <w:color w:val="000000"/>
                 <w:sz w:val="18"/>
@@ -2653,7 +2653,7 @@
             </w:pPr>
             <w:r>
               <w:rPr>
-                <w:rFonts w:ascii="Noto Sans KR" w:hAnsi="Noto Sans KR" w:eastAsia="Noto Sans KR"/>
+                <w:rFonts w:ascii="NanumGothic" w:hAnsi="NanumGothic" w:eastAsia="NanumGothic" w:cs="NanumGothic"/>
                 <w:b w:val="0"/>
                 <w:color w:val="000000"/>
                 <w:sz w:val="18"/>
@@ -2689,7 +2689,7 @@
             </w:pPr>
             <w:r>
               <w:rPr>
-                <w:rFonts w:ascii="Noto Sans KR" w:hAnsi="Noto Sans KR" w:eastAsia="Noto Sans KR"/>
+                <w:rFonts w:ascii="NanumGothic" w:hAnsi="NanumGothic" w:eastAsia="NanumGothic" w:cs="NanumGothic"/>
                 <w:b w:val="0"/>
                 <w:color w:val="000000"/>
                 <w:sz w:val="18"/>
@@ -2725,7 +2725,7 @@
             </w:pPr>
             <w:r>
               <w:rPr>
-                <w:rFonts w:ascii="Noto Sans KR" w:hAnsi="Noto Sans KR" w:eastAsia="Noto Sans KR"/>
+                <w:rFonts w:ascii="NanumGothic" w:hAnsi="NanumGothic" w:eastAsia="NanumGothic" w:cs="NanumGothic"/>
                 <w:b w:val="0"/>
                 <w:color w:val="000000"/>
                 <w:sz w:val="18"/>
@@ -2765,7 +2765,7 @@
             </w:pPr>
             <w:r>
               <w:rPr>
-                <w:rFonts w:ascii="Noto Sans KR" w:hAnsi="Noto Sans KR" w:eastAsia="Noto Sans KR"/>
+                <w:rFonts w:ascii="NanumGothic" w:hAnsi="NanumGothic" w:eastAsia="NanumGothic" w:cs="NanumGothic"/>
                 <w:b w:val="0"/>
                 <w:color w:val="000000"/>
                 <w:sz w:val="18"/>
@@ -2800,7 +2800,7 @@
             </w:pPr>
             <w:r>
               <w:rPr>
-                <w:rFonts w:ascii="Noto Sans KR" w:hAnsi="Noto Sans KR" w:eastAsia="Noto Sans KR"/>
+                <w:rFonts w:ascii="NanumGothic" w:hAnsi="NanumGothic" w:eastAsia="NanumGothic" w:cs="NanumGothic"/>
                 <w:b w:val="0"/>
                 <w:color w:val="000000"/>
                 <w:sz w:val="18"/>
@@ -2835,7 +2835,7 @@
             </w:pPr>
             <w:r>
               <w:rPr>
-                <w:rFonts w:ascii="Noto Sans KR" w:hAnsi="Noto Sans KR" w:eastAsia="Noto Sans KR"/>
+                <w:rFonts w:ascii="NanumGothic" w:hAnsi="NanumGothic" w:eastAsia="NanumGothic" w:cs="NanumGothic"/>
                 <w:b w:val="0"/>
                 <w:color w:val="000000"/>
                 <w:sz w:val="18"/>
@@ -2904,7 +2904,7 @@
             </w:pPr>
             <w:r>
               <w:rPr>
-                <w:rFonts w:ascii="Noto Sans KR" w:hAnsi="Noto Sans KR" w:eastAsia="Noto Sans KR"/>
+                <w:rFonts w:ascii="NanumGothic" w:hAnsi="NanumGothic" w:eastAsia="NanumGothic" w:cs="NanumGothic"/>
                 <w:b/>
                 <w:color w:val="FFFFFF"/>
                 <w:sz w:val="18"/>
@@ -2940,7 +2940,7 @@
             </w:pPr>
             <w:r>
               <w:rPr>
-                <w:rFonts w:ascii="Noto Sans KR" w:hAnsi="Noto Sans KR" w:eastAsia="Noto Sans KR"/>
+                <w:rFonts w:ascii="NanumGothic" w:hAnsi="NanumGothic" w:eastAsia="NanumGothic" w:cs="NanumGothic"/>
                 <w:b/>
                 <w:color w:val="FFFFFF"/>
                 <w:sz w:val="18"/>
@@ -2980,7 +2980,7 @@
             </w:pPr>
             <w:r>
               <w:rPr>
-                <w:rFonts w:ascii="Noto Sans KR" w:hAnsi="Noto Sans KR" w:eastAsia="Noto Sans KR"/>
+                <w:rFonts w:ascii="NanumGothic" w:hAnsi="NanumGothic" w:eastAsia="NanumGothic" w:cs="NanumGothic"/>
                 <w:b w:val="0"/>
                 <w:color w:val="000000"/>
                 <w:sz w:val="18"/>
@@ -3015,7 +3015,7 @@
             </w:pPr>
             <w:r>
               <w:rPr>
-                <w:rFonts w:ascii="Noto Sans KR" w:hAnsi="Noto Sans KR" w:eastAsia="Noto Sans KR"/>
+                <w:rFonts w:ascii="NanumGothic" w:hAnsi="NanumGothic" w:eastAsia="NanumGothic" w:cs="NanumGothic"/>
                 <w:b w:val="0"/>
                 <w:color w:val="000000"/>
                 <w:sz w:val="18"/>
@@ -3056,7 +3056,7 @@
             </w:pPr>
             <w:r>
               <w:rPr>
-                <w:rFonts w:ascii="Noto Sans KR" w:hAnsi="Noto Sans KR" w:eastAsia="Noto Sans KR"/>
+                <w:rFonts w:ascii="NanumGothic" w:hAnsi="NanumGothic" w:eastAsia="NanumGothic" w:cs="NanumGothic"/>
                 <w:b w:val="0"/>
                 <w:color w:val="000000"/>
                 <w:sz w:val="18"/>
@@ -3092,7 +3092,7 @@
             </w:pPr>
             <w:r>
               <w:rPr>
-                <w:rFonts w:ascii="Noto Sans KR" w:hAnsi="Noto Sans KR" w:eastAsia="Noto Sans KR"/>
+                <w:rFonts w:ascii="NanumGothic" w:hAnsi="NanumGothic" w:eastAsia="NanumGothic" w:cs="NanumGothic"/>
                 <w:b w:val="0"/>
                 <w:color w:val="000000"/>
                 <w:sz w:val="18"/>
@@ -3132,7 +3132,7 @@
             </w:pPr>
             <w:r>
               <w:rPr>
-                <w:rFonts w:ascii="Noto Sans KR" w:hAnsi="Noto Sans KR" w:eastAsia="Noto Sans KR"/>
+                <w:rFonts w:ascii="NanumGothic" w:hAnsi="NanumGothic" w:eastAsia="NanumGothic" w:cs="NanumGothic"/>
                 <w:b w:val="0"/>
                 <w:color w:val="000000"/>
                 <w:sz w:val="18"/>
@@ -3167,7 +3167,7 @@
             </w:pPr>
             <w:r>
               <w:rPr>
-                <w:rFonts w:ascii="Noto Sans KR" w:hAnsi="Noto Sans KR" w:eastAsia="Noto Sans KR"/>
+                <w:rFonts w:ascii="NanumGothic" w:hAnsi="NanumGothic" w:eastAsia="NanumGothic" w:cs="NanumGothic"/>
                 <w:b w:val="0"/>
                 <w:color w:val="000000"/>
                 <w:sz w:val="18"/>
@@ -3208,7 +3208,7 @@
             </w:pPr>
             <w:r>
               <w:rPr>
-                <w:rFonts w:ascii="Noto Sans KR" w:hAnsi="Noto Sans KR" w:eastAsia="Noto Sans KR"/>
+                <w:rFonts w:ascii="NanumGothic" w:hAnsi="NanumGothic" w:eastAsia="NanumGothic" w:cs="NanumGothic"/>
                 <w:b w:val="0"/>
                 <w:color w:val="000000"/>
                 <w:sz w:val="18"/>
@@ -3244,7 +3244,7 @@
             </w:pPr>
             <w:r>
               <w:rPr>
-                <w:rFonts w:ascii="Noto Sans KR" w:hAnsi="Noto Sans KR" w:eastAsia="Noto Sans KR"/>
+                <w:rFonts w:ascii="NanumGothic" w:hAnsi="NanumGothic" w:eastAsia="NanumGothic" w:cs="NanumGothic"/>
                 <w:b w:val="0"/>
                 <w:color w:val="000000"/>
                 <w:sz w:val="18"/>
@@ -3284,7 +3284,7 @@
             </w:pPr>
             <w:r>
               <w:rPr>
-                <w:rFonts w:ascii="Noto Sans KR" w:hAnsi="Noto Sans KR" w:eastAsia="Noto Sans KR"/>
+                <w:rFonts w:ascii="NanumGothic" w:hAnsi="NanumGothic" w:eastAsia="NanumGothic" w:cs="NanumGothic"/>
                 <w:b w:val="0"/>
                 <w:color w:val="000000"/>
                 <w:sz w:val="18"/>
@@ -3319,7 +3319,7 @@
             </w:pPr>
             <w:r>
               <w:rPr>
-                <w:rFonts w:ascii="Noto Sans KR" w:hAnsi="Noto Sans KR" w:eastAsia="Noto Sans KR"/>
+                <w:rFonts w:ascii="NanumGothic" w:hAnsi="NanumGothic" w:eastAsia="NanumGothic" w:cs="NanumGothic"/>
                 <w:b w:val="0"/>
                 <w:color w:val="000000"/>
                 <w:sz w:val="18"/>
@@ -3360,7 +3360,7 @@
             </w:pPr>
             <w:r>
               <w:rPr>
-                <w:rFonts w:ascii="Noto Sans KR" w:hAnsi="Noto Sans KR" w:eastAsia="Noto Sans KR"/>
+                <w:rFonts w:ascii="NanumGothic" w:hAnsi="NanumGothic" w:eastAsia="NanumGothic" w:cs="NanumGothic"/>
                 <w:b w:val="0"/>
                 <w:color w:val="000000"/>
                 <w:sz w:val="18"/>
@@ -3396,7 +3396,7 @@
             </w:pPr>
             <w:r>
               <w:rPr>
-                <w:rFonts w:ascii="Noto Sans KR" w:hAnsi="Noto Sans KR" w:eastAsia="Noto Sans KR"/>
+                <w:rFonts w:ascii="NanumGothic" w:hAnsi="NanumGothic" w:eastAsia="NanumGothic" w:cs="NanumGothic"/>
                 <w:b w:val="0"/>
                 <w:color w:val="000000"/>
                 <w:sz w:val="18"/>
@@ -3436,7 +3436,7 @@
             </w:pPr>
             <w:r>
               <w:rPr>
-                <w:rFonts w:ascii="Noto Sans KR" w:hAnsi="Noto Sans KR" w:eastAsia="Noto Sans KR"/>
+                <w:rFonts w:ascii="NanumGothic" w:hAnsi="NanumGothic" w:eastAsia="NanumGothic" w:cs="NanumGothic"/>
                 <w:b w:val="0"/>
                 <w:color w:val="000000"/>
                 <w:sz w:val="18"/>
@@ -3471,7 +3471,7 @@
             </w:pPr>
             <w:r>
               <w:rPr>
-                <w:rFonts w:ascii="Noto Sans KR" w:hAnsi="Noto Sans KR" w:eastAsia="Noto Sans KR"/>
+                <w:rFonts w:ascii="NanumGothic" w:hAnsi="NanumGothic" w:eastAsia="NanumGothic" w:cs="NanumGothic"/>
                 <w:b w:val="0"/>
                 <w:color w:val="000000"/>
                 <w:sz w:val="18"/>
@@ -3503,7 +3503,7 @@
       </w:pPr>
       <w:r>
         <w:rPr>
-          <w:rFonts w:ascii="Noto Sans KR" w:hAnsi="Noto Sans KR" w:eastAsia="Noto Sans KR"/>
+          <w:rFonts w:ascii="NanumGothic" w:hAnsi="NanumGothic" w:eastAsia="NanumGothic" w:cs="NanumGothic"/>
           <w:b w:val="0"/>
           <w:color w:val="000000"/>
           <w:sz w:val="21"/>
@@ -3528,7 +3528,7 @@
       </w:pPr>
       <w:r>
         <w:rPr>
-          <w:rFonts w:ascii="Noto Sans KR" w:hAnsi="Noto Sans KR" w:eastAsia="Noto Sans KR"/>
+          <w:rFonts w:ascii="NanumGothic" w:hAnsi="NanumGothic" w:eastAsia="NanumGothic" w:cs="NanumGothic"/>
           <w:b w:val="0"/>
           <w:color w:val="000000"/>
           <w:sz w:val="21"/>
@@ -3544,7 +3544,7 @@
       </w:pPr>
       <w:r>
         <w:rPr>
-          <w:rFonts w:ascii="Noto Sans KR" w:hAnsi="Noto Sans KR" w:eastAsia="Noto Sans KR"/>
+          <w:rFonts w:ascii="NanumGothic" w:hAnsi="NanumGothic" w:eastAsia="NanumGothic" w:cs="NanumGothic"/>
           <w:b w:val="0"/>
           <w:color w:val="000000"/>
           <w:sz w:val="21"/>
@@ -3560,7 +3560,7 @@
       </w:pPr>
       <w:r>
         <w:rPr>
-          <w:rFonts w:ascii="Noto Sans KR" w:hAnsi="Noto Sans KR" w:eastAsia="Noto Sans KR"/>
+          <w:rFonts w:ascii="NanumGothic" w:hAnsi="NanumGothic" w:eastAsia="NanumGothic" w:cs="NanumGothic"/>
           <w:b w:val="0"/>
           <w:color w:val="000000"/>
           <w:sz w:val="21"/>
@@ -3576,7 +3576,7 @@
       </w:pPr>
       <w:r>
         <w:rPr>
-          <w:rFonts w:ascii="Noto Sans KR" w:hAnsi="Noto Sans KR" w:eastAsia="Noto Sans KR"/>
+          <w:rFonts w:ascii="NanumGothic" w:hAnsi="NanumGothic" w:eastAsia="NanumGothic" w:cs="NanumGothic"/>
           <w:b w:val="0"/>
           <w:color w:val="000000"/>
           <w:sz w:val="21"/>
@@ -3592,7 +3592,7 @@
       </w:pPr>
       <w:r>
         <w:rPr>
-          <w:rFonts w:ascii="Noto Sans KR" w:hAnsi="Noto Sans KR" w:eastAsia="Noto Sans KR"/>
+          <w:rFonts w:ascii="NanumGothic" w:hAnsi="NanumGothic" w:eastAsia="NanumGothic" w:cs="NanumGothic"/>
           <w:b w:val="0"/>
           <w:color w:val="000000"/>
           <w:sz w:val="21"/>
@@ -3608,7 +3608,7 @@
       </w:pPr>
       <w:r>
         <w:rPr>
-          <w:rFonts w:ascii="Noto Sans KR" w:hAnsi="Noto Sans KR" w:eastAsia="Noto Sans KR"/>
+          <w:rFonts w:ascii="NanumGothic" w:hAnsi="NanumGothic" w:eastAsia="NanumGothic" w:cs="NanumGothic"/>
           <w:b w:val="0"/>
           <w:color w:val="000000"/>
           <w:sz w:val="21"/>
@@ -3670,7 +3670,7 @@
             </w:pPr>
             <w:r>
               <w:rPr>
-                <w:rFonts w:ascii="Noto Sans KR" w:hAnsi="Noto Sans KR" w:eastAsia="Noto Sans KR"/>
+                <w:rFonts w:ascii="NanumGothic" w:hAnsi="NanumGothic" w:eastAsia="NanumGothic" w:cs="NanumGothic"/>
                 <w:b/>
                 <w:color w:val="FFFFFF"/>
                 <w:sz w:val="18"/>
@@ -3706,7 +3706,7 @@
             </w:pPr>
             <w:r>
               <w:rPr>
-                <w:rFonts w:ascii="Noto Sans KR" w:hAnsi="Noto Sans KR" w:eastAsia="Noto Sans KR"/>
+                <w:rFonts w:ascii="NanumGothic" w:hAnsi="NanumGothic" w:eastAsia="NanumGothic" w:cs="NanumGothic"/>
                 <w:b/>
                 <w:color w:val="FFFFFF"/>
                 <w:sz w:val="18"/>
@@ -3742,7 +3742,7 @@
             </w:pPr>
             <w:r>
               <w:rPr>
-                <w:rFonts w:ascii="Noto Sans KR" w:hAnsi="Noto Sans KR" w:eastAsia="Noto Sans KR"/>
+                <w:rFonts w:ascii="NanumGothic" w:hAnsi="NanumGothic" w:eastAsia="NanumGothic" w:cs="NanumGothic"/>
                 <w:b/>
                 <w:color w:val="FFFFFF"/>
                 <w:sz w:val="18"/>
@@ -3782,7 +3782,7 @@
             </w:pPr>
             <w:r>
               <w:rPr>
-                <w:rFonts w:ascii="Noto Sans KR" w:hAnsi="Noto Sans KR" w:eastAsia="Noto Sans KR"/>
+                <w:rFonts w:ascii="NanumGothic" w:hAnsi="NanumGothic" w:eastAsia="NanumGothic" w:cs="NanumGothic"/>
                 <w:b w:val="0"/>
                 <w:color w:val="000000"/>
                 <w:sz w:val="18"/>
@@ -3817,7 +3817,7 @@
             </w:pPr>
             <w:r>
               <w:rPr>
-                <w:rFonts w:ascii="Noto Sans KR" w:hAnsi="Noto Sans KR" w:eastAsia="Noto Sans KR"/>
+                <w:rFonts w:ascii="NanumGothic" w:hAnsi="NanumGothic" w:eastAsia="NanumGothic" w:cs="NanumGothic"/>
                 <w:b w:val="0"/>
                 <w:color w:val="000000"/>
                 <w:sz w:val="18"/>
@@ -3852,7 +3852,7 @@
             </w:pPr>
             <w:r>
               <w:rPr>
-                <w:rFonts w:ascii="Noto Sans KR" w:hAnsi="Noto Sans KR" w:eastAsia="Noto Sans KR"/>
+                <w:rFonts w:ascii="NanumGothic" w:hAnsi="NanumGothic" w:eastAsia="NanumGothic" w:cs="NanumGothic"/>
                 <w:b w:val="0"/>
                 <w:color w:val="000000"/>
                 <w:sz w:val="18"/>
@@ -3893,7 +3893,7 @@
             </w:pPr>
             <w:r>
               <w:rPr>
-                <w:rFonts w:ascii="Noto Sans KR" w:hAnsi="Noto Sans KR" w:eastAsia="Noto Sans KR"/>
+                <w:rFonts w:ascii="NanumGothic" w:hAnsi="NanumGothic" w:eastAsia="NanumGothic" w:cs="NanumGothic"/>
                 <w:b w:val="0"/>
                 <w:color w:val="000000"/>
                 <w:sz w:val="18"/>
@@ -3929,7 +3929,7 @@
             </w:pPr>
             <w:r>
               <w:rPr>
-                <w:rFonts w:ascii="Noto Sans KR" w:hAnsi="Noto Sans KR" w:eastAsia="Noto Sans KR"/>
+                <w:rFonts w:ascii="NanumGothic" w:hAnsi="NanumGothic" w:eastAsia="NanumGothic" w:cs="NanumGothic"/>
                 <w:b w:val="0"/>
                 <w:color w:val="000000"/>
                 <w:sz w:val="18"/>
@@ -3965,7 +3965,7 @@
             </w:pPr>
             <w:r>
               <w:rPr>
-                <w:rFonts w:ascii="Noto Sans KR" w:hAnsi="Noto Sans KR" w:eastAsia="Noto Sans KR"/>
+                <w:rFonts w:ascii="NanumGothic" w:hAnsi="NanumGothic" w:eastAsia="NanumGothic" w:cs="NanumGothic"/>
                 <w:b w:val="0"/>
                 <w:color w:val="000000"/>
                 <w:sz w:val="18"/>
@@ -4005,7 +4005,7 @@
             </w:pPr>
             <w:r>
               <w:rPr>
-                <w:rFonts w:ascii="Noto Sans KR" w:hAnsi="Noto Sans KR" w:eastAsia="Noto Sans KR"/>
+                <w:rFonts w:ascii="NanumGothic" w:hAnsi="NanumGothic" w:eastAsia="NanumGothic" w:cs="NanumGothic"/>
                 <w:b w:val="0"/>
                 <w:color w:val="000000"/>
                 <w:sz w:val="18"/>
@@ -4040,7 +4040,7 @@
             </w:pPr>
             <w:r>
               <w:rPr>
-                <w:rFonts w:ascii="Noto Sans KR" w:hAnsi="Noto Sans KR" w:eastAsia="Noto Sans KR"/>
+                <w:rFonts w:ascii="NanumGothic" w:hAnsi="NanumGothic" w:eastAsia="NanumGothic" w:cs="NanumGothic"/>
                 <w:b w:val="0"/>
                 <w:color w:val="000000"/>
                 <w:sz w:val="18"/>
@@ -4075,7 +4075,7 @@
             </w:pPr>
             <w:r>
               <w:rPr>
-                <w:rFonts w:ascii="Noto Sans KR" w:hAnsi="Noto Sans KR" w:eastAsia="Noto Sans KR"/>
+                <w:rFonts w:ascii="NanumGothic" w:hAnsi="NanumGothic" w:eastAsia="NanumGothic" w:cs="NanumGothic"/>
                 <w:b w:val="0"/>
                 <w:color w:val="000000"/>
                 <w:sz w:val="18"/>
@@ -4116,7 +4116,7 @@
             </w:pPr>
             <w:r>
               <w:rPr>
-                <w:rFonts w:ascii="Noto Sans KR" w:hAnsi="Noto Sans KR" w:eastAsia="Noto Sans KR"/>
+                <w:rFonts w:ascii="NanumGothic" w:hAnsi="NanumGothic" w:eastAsia="NanumGothic" w:cs="NanumGothic"/>
                 <w:b w:val="0"/>
                 <w:color w:val="000000"/>
                 <w:sz w:val="18"/>
@@ -4152,7 +4152,7 @@
             </w:pPr>
             <w:r>
               <w:rPr>
-                <w:rFonts w:ascii="Noto Sans KR" w:hAnsi="Noto Sans KR" w:eastAsia="Noto Sans KR"/>
+                <w:rFonts w:ascii="NanumGothic" w:hAnsi="NanumGothic" w:eastAsia="NanumGothic" w:cs="NanumGothic"/>
                 <w:b w:val="0"/>
                 <w:color w:val="000000"/>
                 <w:sz w:val="18"/>
@@ -4188,7 +4188,7 @@
             </w:pPr>
             <w:r>
               <w:rPr>
-                <w:rFonts w:ascii="Noto Sans KR" w:hAnsi="Noto Sans KR" w:eastAsia="Noto Sans KR"/>
+                <w:rFonts w:ascii="NanumGothic" w:hAnsi="NanumGothic" w:eastAsia="NanumGothic" w:cs="NanumGothic"/>
                 <w:b w:val="0"/>
                 <w:color w:val="000000"/>
                 <w:sz w:val="18"/>
@@ -4228,7 +4228,7 @@
             </w:pPr>
             <w:r>
               <w:rPr>
-                <w:rFonts w:ascii="Noto Sans KR" w:hAnsi="Noto Sans KR" w:eastAsia="Noto Sans KR"/>
+                <w:rFonts w:ascii="NanumGothic" w:hAnsi="NanumGothic" w:eastAsia="NanumGothic" w:cs="NanumGothic"/>
                 <w:b w:val="0"/>
                 <w:color w:val="000000"/>
                 <w:sz w:val="18"/>
@@ -4263,7 +4263,7 @@
             </w:pPr>
             <w:r>
               <w:rPr>
-                <w:rFonts w:ascii="Noto Sans KR" w:hAnsi="Noto Sans KR" w:eastAsia="Noto Sans KR"/>
+                <w:rFonts w:ascii="NanumGothic" w:hAnsi="NanumGothic" w:eastAsia="NanumGothic" w:cs="NanumGothic"/>
                 <w:b w:val="0"/>
                 <w:color w:val="000000"/>
                 <w:sz w:val="18"/>
@@ -4298,7 +4298,7 @@
             </w:pPr>
             <w:r>
               <w:rPr>
-                <w:rFonts w:ascii="Noto Sans KR" w:hAnsi="Noto Sans KR" w:eastAsia="Noto Sans KR"/>
+                <w:rFonts w:ascii="NanumGothic" w:hAnsi="NanumGothic" w:eastAsia="NanumGothic" w:cs="NanumGothic"/>
                 <w:b w:val="0"/>
                 <w:color w:val="000000"/>
                 <w:sz w:val="18"/>
@@ -4367,7 +4367,7 @@
             </w:pPr>
             <w:r>
               <w:rPr>
-                <w:rFonts w:ascii="Noto Sans KR" w:hAnsi="Noto Sans KR" w:eastAsia="Noto Sans KR"/>
+                <w:rFonts w:ascii="NanumGothic" w:hAnsi="NanumGothic" w:eastAsia="NanumGothic" w:cs="NanumGothic"/>
                 <w:b/>
                 <w:color w:val="FFFFFF"/>
                 <w:sz w:val="18"/>
@@ -4403,7 +4403,7 @@
             </w:pPr>
             <w:r>
               <w:rPr>
-                <w:rFonts w:ascii="Noto Sans KR" w:hAnsi="Noto Sans KR" w:eastAsia="Noto Sans KR"/>
+                <w:rFonts w:ascii="NanumGothic" w:hAnsi="NanumGothic" w:eastAsia="NanumGothic" w:cs="NanumGothic"/>
                 <w:b/>
                 <w:color w:val="FFFFFF"/>
                 <w:sz w:val="18"/>
@@ -4443,7 +4443,7 @@
             </w:pPr>
             <w:r>
               <w:rPr>
-                <w:rFonts w:ascii="Noto Sans KR" w:hAnsi="Noto Sans KR" w:eastAsia="Noto Sans KR"/>
+                <w:rFonts w:ascii="NanumGothic" w:hAnsi="NanumGothic" w:eastAsia="NanumGothic" w:cs="NanumGothic"/>
                 <w:b w:val="0"/>
                 <w:color w:val="000000"/>
                 <w:sz w:val="18"/>
@@ -4478,7 +4478,7 @@
             </w:pPr>
             <w:r>
               <w:rPr>
-                <w:rFonts w:ascii="Noto Sans KR" w:hAnsi="Noto Sans KR" w:eastAsia="Noto Sans KR"/>
+                <w:rFonts w:ascii="NanumGothic" w:hAnsi="NanumGothic" w:eastAsia="NanumGothic" w:cs="NanumGothic"/>
                 <w:b w:val="0"/>
                 <w:color w:val="000000"/>
                 <w:sz w:val="18"/>
@@ -4519,7 +4519,7 @@
             </w:pPr>
             <w:r>
               <w:rPr>
-                <w:rFonts w:ascii="Noto Sans KR" w:hAnsi="Noto Sans KR" w:eastAsia="Noto Sans KR"/>
+                <w:rFonts w:ascii="NanumGothic" w:hAnsi="NanumGothic" w:eastAsia="NanumGothic" w:cs="NanumGothic"/>
                 <w:b w:val="0"/>
                 <w:color w:val="000000"/>
                 <w:sz w:val="18"/>
@@ -4555,7 +4555,7 @@
             </w:pPr>
             <w:r>
               <w:rPr>
-                <w:rFonts w:ascii="Noto Sans KR" w:hAnsi="Noto Sans KR" w:eastAsia="Noto Sans KR"/>
+                <w:rFonts w:ascii="NanumGothic" w:hAnsi="NanumGothic" w:eastAsia="NanumGothic" w:cs="NanumGothic"/>
                 <w:b w:val="0"/>
                 <w:color w:val="000000"/>
                 <w:sz w:val="18"/>
@@ -4595,7 +4595,7 @@
             </w:pPr>
             <w:r>
               <w:rPr>
-                <w:rFonts w:ascii="Noto Sans KR" w:hAnsi="Noto Sans KR" w:eastAsia="Noto Sans KR"/>
+                <w:rFonts w:ascii="NanumGothic" w:hAnsi="NanumGothic" w:eastAsia="NanumGothic" w:cs="NanumGothic"/>
                 <w:b w:val="0"/>
                 <w:color w:val="000000"/>
                 <w:sz w:val="18"/>
@@ -4630,7 +4630,7 @@
             </w:pPr>
             <w:r>
               <w:rPr>
-                <w:rFonts w:ascii="Noto Sans KR" w:hAnsi="Noto Sans KR" w:eastAsia="Noto Sans KR"/>
+                <w:rFonts w:ascii="NanumGothic" w:hAnsi="NanumGothic" w:eastAsia="NanumGothic" w:cs="NanumGothic"/>
                 <w:b w:val="0"/>
                 <w:color w:val="000000"/>
                 <w:sz w:val="18"/>
@@ -4671,7 +4671,7 @@
             </w:pPr>
             <w:r>
               <w:rPr>
-                <w:rFonts w:ascii="Noto Sans KR" w:hAnsi="Noto Sans KR" w:eastAsia="Noto Sans KR"/>
+                <w:rFonts w:ascii="NanumGothic" w:hAnsi="NanumGothic" w:eastAsia="NanumGothic" w:cs="NanumGothic"/>
                 <w:b w:val="0"/>
                 <w:color w:val="000000"/>
                 <w:sz w:val="18"/>
@@ -4707,7 +4707,7 @@
             </w:pPr>
             <w:r>
               <w:rPr>
-                <w:rFonts w:ascii="Noto Sans KR" w:hAnsi="Noto Sans KR" w:eastAsia="Noto Sans KR"/>
+                <w:rFonts w:ascii="NanumGothic" w:hAnsi="NanumGothic" w:eastAsia="NanumGothic" w:cs="NanumGothic"/>
                 <w:b w:val="0"/>
                 <w:color w:val="000000"/>
                 <w:sz w:val="18"/>
@@ -4747,7 +4747,7 @@
             </w:pPr>
             <w:r>
               <w:rPr>
-                <w:rFonts w:ascii="Noto Sans KR" w:hAnsi="Noto Sans KR" w:eastAsia="Noto Sans KR"/>
+                <w:rFonts w:ascii="NanumGothic" w:hAnsi="NanumGothic" w:eastAsia="NanumGothic" w:cs="NanumGothic"/>
                 <w:b w:val="0"/>
                 <w:color w:val="000000"/>
                 <w:sz w:val="18"/>
@@ -4782,7 +4782,7 @@
             </w:pPr>
             <w:r>
               <w:rPr>
-                <w:rFonts w:ascii="Noto Sans KR" w:hAnsi="Noto Sans KR" w:eastAsia="Noto Sans KR"/>
+                <w:rFonts w:ascii="NanumGothic" w:hAnsi="NanumGothic" w:eastAsia="NanumGothic" w:cs="NanumGothic"/>
                 <w:b w:val="0"/>
                 <w:color w:val="000000"/>
                 <w:sz w:val="18"/>
@@ -4823,7 +4823,7 @@
             </w:pPr>
             <w:r>
               <w:rPr>
-                <w:rFonts w:ascii="Noto Sans KR" w:hAnsi="Noto Sans KR" w:eastAsia="Noto Sans KR"/>
+                <w:rFonts w:ascii="NanumGothic" w:hAnsi="NanumGothic" w:eastAsia="NanumGothic" w:cs="NanumGothic"/>
                 <w:b w:val="0"/>
                 <w:color w:val="000000"/>
                 <w:sz w:val="18"/>
@@ -4859,7 +4859,7 @@
             </w:pPr>
             <w:r>
               <w:rPr>
-                <w:rFonts w:ascii="Noto Sans KR" w:hAnsi="Noto Sans KR" w:eastAsia="Noto Sans KR"/>
+                <w:rFonts w:ascii="NanumGothic" w:hAnsi="NanumGothic" w:eastAsia="NanumGothic" w:cs="NanumGothic"/>
                 <w:b w:val="0"/>
                 <w:color w:val="000000"/>
                 <w:sz w:val="18"/>
@@ -4929,7 +4929,7 @@
             </w:pPr>
             <w:r>
               <w:rPr>
-                <w:rFonts w:ascii="Noto Sans KR" w:hAnsi="Noto Sans KR" w:eastAsia="Noto Sans KR"/>
+                <w:rFonts w:ascii="NanumGothic" w:hAnsi="NanumGothic" w:eastAsia="NanumGothic" w:cs="NanumGothic"/>
                 <w:b/>
                 <w:color w:val="FFFFFF"/>
                 <w:sz w:val="18"/>
@@ -4965,7 +4965,7 @@
             </w:pPr>
             <w:r>
               <w:rPr>
-                <w:rFonts w:ascii="Noto Sans KR" w:hAnsi="Noto Sans KR" w:eastAsia="Noto Sans KR"/>
+                <w:rFonts w:ascii="NanumGothic" w:hAnsi="NanumGothic" w:eastAsia="NanumGothic" w:cs="NanumGothic"/>
                 <w:b/>
                 <w:color w:val="FFFFFF"/>
                 <w:sz w:val="18"/>
@@ -5001,7 +5001,7 @@
             </w:pPr>
             <w:r>
               <w:rPr>
-                <w:rFonts w:ascii="Noto Sans KR" w:hAnsi="Noto Sans KR" w:eastAsia="Noto Sans KR"/>
+                <w:rFonts w:ascii="NanumGothic" w:hAnsi="NanumGothic" w:eastAsia="NanumGothic" w:cs="NanumGothic"/>
                 <w:b/>
                 <w:color w:val="FFFFFF"/>
                 <w:sz w:val="18"/>
@@ -5041,7 +5041,7 @@
             </w:pPr>
             <w:r>
               <w:rPr>
-                <w:rFonts w:ascii="Noto Sans KR" w:hAnsi="Noto Sans KR" w:eastAsia="Noto Sans KR"/>
+                <w:rFonts w:ascii="NanumGothic" w:hAnsi="NanumGothic" w:eastAsia="NanumGothic" w:cs="NanumGothic"/>
                 <w:b w:val="0"/>
                 <w:color w:val="000000"/>
                 <w:sz w:val="18"/>
@@ -5076,7 +5076,7 @@
             </w:pPr>
             <w:r>
               <w:rPr>
-                <w:rFonts w:ascii="Noto Sans KR" w:hAnsi="Noto Sans KR" w:eastAsia="Noto Sans KR"/>
+                <w:rFonts w:ascii="NanumGothic" w:hAnsi="NanumGothic" w:eastAsia="NanumGothic" w:cs="NanumGothic"/>
                 <w:b w:val="0"/>
                 <w:color w:val="000000"/>
                 <w:sz w:val="18"/>
@@ -5111,7 +5111,7 @@
             </w:pPr>
             <w:r>
               <w:rPr>
-                <w:rFonts w:ascii="Noto Sans KR" w:hAnsi="Noto Sans KR" w:eastAsia="Noto Sans KR"/>
+                <w:rFonts w:ascii="NanumGothic" w:hAnsi="NanumGothic" w:eastAsia="NanumGothic" w:cs="NanumGothic"/>
                 <w:b w:val="0"/>
                 <w:color w:val="000000"/>
                 <w:sz w:val="18"/>
@@ -5152,7 +5152,7 @@
             </w:pPr>
             <w:r>
               <w:rPr>
-                <w:rFonts w:ascii="Noto Sans KR" w:hAnsi="Noto Sans KR" w:eastAsia="Noto Sans KR"/>
+                <w:rFonts w:ascii="NanumGothic" w:hAnsi="NanumGothic" w:eastAsia="NanumGothic" w:cs="NanumGothic"/>
                 <w:b w:val="0"/>
                 <w:color w:val="000000"/>
                 <w:sz w:val="18"/>
@@ -5188,7 +5188,7 @@
             </w:pPr>
             <w:r>
               <w:rPr>
-                <w:rFonts w:ascii="Noto Sans KR" w:hAnsi="Noto Sans KR" w:eastAsia="Noto Sans KR"/>
+                <w:rFonts w:ascii="NanumGothic" w:hAnsi="NanumGothic" w:eastAsia="NanumGothic" w:cs="NanumGothic"/>
                 <w:b w:val="0"/>
                 <w:color w:val="000000"/>
                 <w:sz w:val="18"/>
@@ -5224,7 +5224,7 @@
             </w:pPr>
             <w:r>
               <w:rPr>
-                <w:rFonts w:ascii="Noto Sans KR" w:hAnsi="Noto Sans KR" w:eastAsia="Noto Sans KR"/>
+                <w:rFonts w:ascii="NanumGothic" w:hAnsi="NanumGothic" w:eastAsia="NanumGothic" w:cs="NanumGothic"/>
                 <w:b w:val="0"/>
                 <w:color w:val="000000"/>
                 <w:sz w:val="18"/>
@@ -5264,7 +5264,7 @@
             </w:pPr>
             <w:r>
               <w:rPr>
-                <w:rFonts w:ascii="Noto Sans KR" w:hAnsi="Noto Sans KR" w:eastAsia="Noto Sans KR"/>
+                <w:rFonts w:ascii="NanumGothic" w:hAnsi="NanumGothic" w:eastAsia="NanumGothic" w:cs="NanumGothic"/>
                 <w:b w:val="0"/>
                 <w:color w:val="000000"/>
                 <w:sz w:val="18"/>
@@ -5299,7 +5299,7 @@
             </w:pPr>
             <w:r>
               <w:rPr>
-                <w:rFonts w:ascii="Noto Sans KR" w:hAnsi="Noto Sans KR" w:eastAsia="Noto Sans KR"/>
+                <w:rFonts w:ascii="NanumGothic" w:hAnsi="NanumGothic" w:eastAsia="NanumGothic" w:cs="NanumGothic"/>
                 <w:b w:val="0"/>
                 <w:color w:val="000000"/>
                 <w:sz w:val="18"/>
@@ -5334,7 +5334,7 @@
             </w:pPr>
             <w:r>
               <w:rPr>
-                <w:rFonts w:ascii="Noto Sans KR" w:hAnsi="Noto Sans KR" w:eastAsia="Noto Sans KR"/>
+                <w:rFonts w:ascii="NanumGothic" w:hAnsi="NanumGothic" w:eastAsia="NanumGothic" w:cs="NanumGothic"/>
                 <w:b w:val="0"/>
                 <w:color w:val="000000"/>
                 <w:sz w:val="18"/>
@@ -5375,7 +5375,7 @@
             </w:pPr>
             <w:r>
               <w:rPr>
-                <w:rFonts w:ascii="Noto Sans KR" w:hAnsi="Noto Sans KR" w:eastAsia="Noto Sans KR"/>
+                <w:rFonts w:ascii="NanumGothic" w:hAnsi="NanumGothic" w:eastAsia="NanumGothic" w:cs="NanumGothic"/>
                 <w:b w:val="0"/>
                 <w:color w:val="000000"/>
                 <w:sz w:val="18"/>
@@ -5411,7 +5411,7 @@
             </w:pPr>
             <w:r>
               <w:rPr>
-                <w:rFonts w:ascii="Noto Sans KR" w:hAnsi="Noto Sans KR" w:eastAsia="Noto Sans KR"/>
+                <w:rFonts w:ascii="NanumGothic" w:hAnsi="NanumGothic" w:eastAsia="NanumGothic" w:cs="NanumGothic"/>
                 <w:b w:val="0"/>
                 <w:color w:val="000000"/>
                 <w:sz w:val="18"/>
@@ -5447,7 +5447,7 @@
             </w:pPr>
             <w:r>
               <w:rPr>
-                <w:rFonts w:ascii="Noto Sans KR" w:hAnsi="Noto Sans KR" w:eastAsia="Noto Sans KR"/>
+                <w:rFonts w:ascii="NanumGothic" w:hAnsi="NanumGothic" w:eastAsia="NanumGothic" w:cs="NanumGothic"/>
                 <w:b w:val="0"/>
                 <w:color w:val="000000"/>
                 <w:sz w:val="18"/>
@@ -5487,7 +5487,7 @@
             </w:pPr>
             <w:r>
               <w:rPr>
-                <w:rFonts w:ascii="Noto Sans KR" w:hAnsi="Noto Sans KR" w:eastAsia="Noto Sans KR"/>
+                <w:rFonts w:ascii="NanumGothic" w:hAnsi="NanumGothic" w:eastAsia="NanumGothic" w:cs="NanumGothic"/>
                 <w:b w:val="0"/>
                 <w:color w:val="000000"/>
                 <w:sz w:val="18"/>
@@ -5522,7 +5522,7 @@
             </w:pPr>
             <w:r>
               <w:rPr>
-                <w:rFonts w:ascii="Noto Sans KR" w:hAnsi="Noto Sans KR" w:eastAsia="Noto Sans KR"/>
+                <w:rFonts w:ascii="NanumGothic" w:hAnsi="NanumGothic" w:eastAsia="NanumGothic" w:cs="NanumGothic"/>
                 <w:b w:val="0"/>
                 <w:color w:val="000000"/>
                 <w:sz w:val="18"/>
@@ -5557,7 +5557,7 @@
             </w:pPr>
             <w:r>
               <w:rPr>
-                <w:rFonts w:ascii="Noto Sans KR" w:hAnsi="Noto Sans KR" w:eastAsia="Noto Sans KR"/>
+                <w:rFonts w:ascii="NanumGothic" w:hAnsi="NanumGothic" w:eastAsia="NanumGothic" w:cs="NanumGothic"/>
                 <w:b w:val="0"/>
                 <w:color w:val="000000"/>
                 <w:sz w:val="18"/>
@@ -5598,7 +5598,7 @@
             </w:pPr>
             <w:r>
               <w:rPr>
-                <w:rFonts w:ascii="Noto Sans KR" w:hAnsi="Noto Sans KR" w:eastAsia="Noto Sans KR"/>
+                <w:rFonts w:ascii="NanumGothic" w:hAnsi="NanumGothic" w:eastAsia="NanumGothic" w:cs="NanumGothic"/>
                 <w:b w:val="0"/>
                 <w:color w:val="000000"/>
                 <w:sz w:val="18"/>
@@ -5634,7 +5634,7 @@
             </w:pPr>
             <w:r>
               <w:rPr>
-                <w:rFonts w:ascii="Noto Sans KR" w:hAnsi="Noto Sans KR" w:eastAsia="Noto Sans KR"/>
+                <w:rFonts w:ascii="NanumGothic" w:hAnsi="NanumGothic" w:eastAsia="NanumGothic" w:cs="NanumGothic"/>
                 <w:b w:val="0"/>
                 <w:color w:val="000000"/>
                 <w:sz w:val="18"/>
@@ -5670,7 +5670,7 @@
             </w:pPr>
             <w:r>
               <w:rPr>
-                <w:rFonts w:ascii="Noto Sans KR" w:hAnsi="Noto Sans KR" w:eastAsia="Noto Sans KR"/>
+                <w:rFonts w:ascii="NanumGothic" w:hAnsi="NanumGothic" w:eastAsia="NanumGothic" w:cs="NanumGothic"/>
                 <w:b w:val="0"/>
                 <w:color w:val="000000"/>
                 <w:sz w:val="18"/>
@@ -5740,7 +5740,7 @@
             </w:pPr>
             <w:r>
               <w:rPr>
-                <w:rFonts w:ascii="Noto Sans KR" w:hAnsi="Noto Sans KR" w:eastAsia="Noto Sans KR"/>
+                <w:rFonts w:ascii="NanumGothic" w:hAnsi="NanumGothic" w:eastAsia="NanumGothic" w:cs="NanumGothic"/>
                 <w:b/>
                 <w:color w:val="FFFFFF"/>
                 <w:sz w:val="18"/>
@@ -5776,7 +5776,7 @@
             </w:pPr>
             <w:r>
               <w:rPr>
-                <w:rFonts w:ascii="Noto Sans KR" w:hAnsi="Noto Sans KR" w:eastAsia="Noto Sans KR"/>
+                <w:rFonts w:ascii="NanumGothic" w:hAnsi="NanumGothic" w:eastAsia="NanumGothic" w:cs="NanumGothic"/>
                 <w:b/>
                 <w:color w:val="FFFFFF"/>
                 <w:sz w:val="18"/>
@@ -5812,7 +5812,7 @@
             </w:pPr>
             <w:r>
               <w:rPr>
-                <w:rFonts w:ascii="Noto Sans KR" w:hAnsi="Noto Sans KR" w:eastAsia="Noto Sans KR"/>
+                <w:rFonts w:ascii="NanumGothic" w:hAnsi="NanumGothic" w:eastAsia="NanumGothic" w:cs="NanumGothic"/>
                 <w:b/>
                 <w:color w:val="FFFFFF"/>
                 <w:sz w:val="18"/>
@@ -5852,7 +5852,7 @@
             </w:pPr>
             <w:r>
               <w:rPr>
-                <w:rFonts w:ascii="Noto Sans KR" w:hAnsi="Noto Sans KR" w:eastAsia="Noto Sans KR"/>
+                <w:rFonts w:ascii="NanumGothic" w:hAnsi="NanumGothic" w:eastAsia="NanumGothic" w:cs="NanumGothic"/>
                 <w:b w:val="0"/>
                 <w:color w:val="000000"/>
                 <w:sz w:val="18"/>
@@ -5887,7 +5887,7 @@
             </w:pPr>
             <w:r>
               <w:rPr>
-                <w:rFonts w:ascii="Noto Sans KR" w:hAnsi="Noto Sans KR" w:eastAsia="Noto Sans KR"/>
+                <w:rFonts w:ascii="NanumGothic" w:hAnsi="NanumGothic" w:eastAsia="NanumGothic" w:cs="NanumGothic"/>
                 <w:b w:val="0"/>
                 <w:color w:val="000000"/>
                 <w:sz w:val="18"/>
@@ -5922,7 +5922,7 @@
             </w:pPr>
             <w:r>
               <w:rPr>
-                <w:rFonts w:ascii="Noto Sans KR" w:hAnsi="Noto Sans KR" w:eastAsia="Noto Sans KR"/>
+                <w:rFonts w:ascii="NanumGothic" w:hAnsi="NanumGothic" w:eastAsia="NanumGothic" w:cs="NanumGothic"/>
                 <w:b w:val="0"/>
                 <w:color w:val="000000"/>
                 <w:sz w:val="18"/>
@@ -5963,7 +5963,7 @@
             </w:pPr>
             <w:r>
               <w:rPr>
-                <w:rFonts w:ascii="Noto Sans KR" w:hAnsi="Noto Sans KR" w:eastAsia="Noto Sans KR"/>
+                <w:rFonts w:ascii="NanumGothic" w:hAnsi="NanumGothic" w:eastAsia="NanumGothic" w:cs="NanumGothic"/>
                 <w:b w:val="0"/>
                 <w:color w:val="000000"/>
                 <w:sz w:val="18"/>
@@ -5999,7 +5999,7 @@
             </w:pPr>
             <w:r>
               <w:rPr>
-                <w:rFonts w:ascii="Noto Sans KR" w:hAnsi="Noto Sans KR" w:eastAsia="Noto Sans KR"/>
+                <w:rFonts w:ascii="NanumGothic" w:hAnsi="NanumGothic" w:eastAsia="NanumGothic" w:cs="NanumGothic"/>
                 <w:b w:val="0"/>
                 <w:color w:val="000000"/>
                 <w:sz w:val="18"/>
@@ -6035,7 +6035,7 @@
             </w:pPr>
             <w:r>
               <w:rPr>
-                <w:rFonts w:ascii="Noto Sans KR" w:hAnsi="Noto Sans KR" w:eastAsia="Noto Sans KR"/>
+                <w:rFonts w:ascii="NanumGothic" w:hAnsi="NanumGothic" w:eastAsia="NanumGothic" w:cs="NanumGothic"/>
                 <w:b w:val="0"/>
                 <w:color w:val="000000"/>
                 <w:sz w:val="18"/>
@@ -6075,7 +6075,7 @@
             </w:pPr>
             <w:r>
               <w:rPr>
-                <w:rFonts w:ascii="Noto Sans KR" w:hAnsi="Noto Sans KR" w:eastAsia="Noto Sans KR"/>
+                <w:rFonts w:ascii="NanumGothic" w:hAnsi="NanumGothic" w:eastAsia="NanumGothic" w:cs="NanumGothic"/>
                 <w:b w:val="0"/>
                 <w:color w:val="000000"/>
                 <w:sz w:val="18"/>
@@ -6110,7 +6110,7 @@
             </w:pPr>
             <w:r>
               <w:rPr>
-                <w:rFonts w:ascii="Noto Sans KR" w:hAnsi="Noto Sans KR" w:eastAsia="Noto Sans KR"/>
+                <w:rFonts w:ascii="NanumGothic" w:hAnsi="NanumGothic" w:eastAsia="NanumGothic" w:cs="NanumGothic"/>
                 <w:b w:val="0"/>
                 <w:color w:val="000000"/>
                 <w:sz w:val="18"/>
@@ -6145,7 +6145,7 @@
             </w:pPr>
             <w:r>
               <w:rPr>
-                <w:rFonts w:ascii="Noto Sans KR" w:hAnsi="Noto Sans KR" w:eastAsia="Noto Sans KR"/>
+                <w:rFonts w:ascii="NanumGothic" w:hAnsi="NanumGothic" w:eastAsia="NanumGothic" w:cs="NanumGothic"/>
                 <w:b w:val="0"/>
                 <w:color w:val="000000"/>
                 <w:sz w:val="18"/>
@@ -6186,7 +6186,7 @@
             </w:pPr>
             <w:r>
               <w:rPr>
-                <w:rFonts w:ascii="Noto Sans KR" w:hAnsi="Noto Sans KR" w:eastAsia="Noto Sans KR"/>
+                <w:rFonts w:ascii="NanumGothic" w:hAnsi="NanumGothic" w:eastAsia="NanumGothic" w:cs="NanumGothic"/>
                 <w:b w:val="0"/>
                 <w:color w:val="000000"/>
                 <w:sz w:val="18"/>
@@ -6222,7 +6222,7 @@
             </w:pPr>
             <w:r>
               <w:rPr>
-                <w:rFonts w:ascii="Noto Sans KR" w:hAnsi="Noto Sans KR" w:eastAsia="Noto Sans KR"/>
+                <w:rFonts w:ascii="NanumGothic" w:hAnsi="NanumGothic" w:eastAsia="NanumGothic" w:cs="NanumGothic"/>
                 <w:b w:val="0"/>
                 <w:color w:val="000000"/>
                 <w:sz w:val="18"/>
@@ -6258,7 +6258,7 @@
             </w:pPr>
             <w:r>
               <w:rPr>
-                <w:rFonts w:ascii="Noto Sans KR" w:hAnsi="Noto Sans KR" w:eastAsia="Noto Sans KR"/>
+                <w:rFonts w:ascii="NanumGothic" w:hAnsi="NanumGothic" w:eastAsia="NanumGothic" w:cs="NanumGothic"/>
                 <w:b w:val="0"/>
                 <w:color w:val="000000"/>
                 <w:sz w:val="18"/>
@@ -6298,7 +6298,7 @@
             </w:pPr>
             <w:r>
               <w:rPr>
-                <w:rFonts w:ascii="Noto Sans KR" w:hAnsi="Noto Sans KR" w:eastAsia="Noto Sans KR"/>
+                <w:rFonts w:ascii="NanumGothic" w:hAnsi="NanumGothic" w:eastAsia="NanumGothic" w:cs="NanumGothic"/>
                 <w:b w:val="0"/>
                 <w:color w:val="000000"/>
                 <w:sz w:val="18"/>
@@ -6333,7 +6333,7 @@
             </w:pPr>
             <w:r>
               <w:rPr>
-                <w:rFonts w:ascii="Noto Sans KR" w:hAnsi="Noto Sans KR" w:eastAsia="Noto Sans KR"/>
+                <w:rFonts w:ascii="NanumGothic" w:hAnsi="NanumGothic" w:eastAsia="NanumGothic" w:cs="NanumGothic"/>
                 <w:b w:val="0"/>
                 <w:color w:val="000000"/>
                 <w:sz w:val="18"/>
@@ -6368,7 +6368,7 @@
             </w:pPr>
             <w:r>
               <w:rPr>
-                <w:rFonts w:ascii="Noto Sans KR" w:hAnsi="Noto Sans KR" w:eastAsia="Noto Sans KR"/>
+                <w:rFonts w:ascii="NanumGothic" w:hAnsi="NanumGothic" w:eastAsia="NanumGothic" w:cs="NanumGothic"/>
                 <w:b w:val="0"/>
                 <w:color w:val="000000"/>
                 <w:sz w:val="18"/>
@@ -6400,7 +6400,7 @@
       </w:pPr>
       <w:r>
         <w:rPr>
-          <w:rFonts w:ascii="Noto Sans KR" w:hAnsi="Noto Sans KR" w:eastAsia="Noto Sans KR"/>
+          <w:rFonts w:ascii="NanumGothic" w:hAnsi="NanumGothic" w:eastAsia="NanumGothic" w:cs="NanumGothic"/>
           <w:b w:val="0"/>
           <w:color w:val="000000"/>
           <w:sz w:val="21"/>
@@ -6416,7 +6416,7 @@
       </w:pPr>
       <w:r>
         <w:rPr>
-          <w:rFonts w:ascii="Noto Sans KR" w:hAnsi="Noto Sans KR" w:eastAsia="Noto Sans KR"/>
+          <w:rFonts w:ascii="NanumGothic" w:hAnsi="NanumGothic" w:eastAsia="NanumGothic" w:cs="NanumGothic"/>
           <w:b w:val="0"/>
           <w:color w:val="000000"/>
           <w:sz w:val="19"/>
@@ -6432,7 +6432,7 @@
       </w:pPr>
       <w:r>
         <w:rPr>
-          <w:rFonts w:ascii="Noto Sans KR" w:hAnsi="Noto Sans KR" w:eastAsia="Noto Sans KR"/>
+          <w:rFonts w:ascii="NanumGothic" w:hAnsi="NanumGothic" w:eastAsia="NanumGothic" w:cs="NanumGothic"/>
           <w:b w:val="0"/>
           <w:color w:val="000000"/>
           <w:sz w:val="19"/>
@@ -6448,7 +6448,7 @@
       </w:pPr>
       <w:r>
         <w:rPr>
-          <w:rFonts w:ascii="Noto Sans KR" w:hAnsi="Noto Sans KR" w:eastAsia="Noto Sans KR"/>
+          <w:rFonts w:ascii="NanumGothic" w:hAnsi="NanumGothic" w:eastAsia="NanumGothic" w:cs="NanumGothic"/>
           <w:b w:val="0"/>
           <w:color w:val="000000"/>
           <w:sz w:val="19"/>
@@ -6464,7 +6464,7 @@
       </w:pPr>
       <w:r>
         <w:rPr>
-          <w:rFonts w:ascii="Noto Sans KR" w:hAnsi="Noto Sans KR" w:eastAsia="Noto Sans KR"/>
+          <w:rFonts w:ascii="NanumGothic" w:hAnsi="NanumGothic" w:eastAsia="NanumGothic" w:cs="NanumGothic"/>
           <w:b w:val="0"/>
           <w:color w:val="000000"/>
           <w:sz w:val="19"/>
@@ -6480,7 +6480,7 @@
       </w:pPr>
       <w:r>
         <w:rPr>
-          <w:rFonts w:ascii="Noto Sans KR" w:hAnsi="Noto Sans KR" w:eastAsia="Noto Sans KR"/>
+          <w:rFonts w:ascii="NanumGothic" w:hAnsi="NanumGothic" w:eastAsia="NanumGothic" w:cs="NanumGothic"/>
           <w:b w:val="0"/>
           <w:color w:val="000000"/>
           <w:sz w:val="19"/>
@@ -6508,7 +6508,7 @@
     </w:pPr>
     <w:r>
       <w:rPr>
-        <w:rFonts w:ascii="Noto Sans KR" w:hAnsi="Noto Sans KR" w:eastAsia="Noto Sans KR"/>
+        <w:rFonts w:ascii="NanumGothic" w:hAnsi="NanumGothic" w:eastAsia="NanumGothic" w:cs="NanumGothic"/>
         <w:b w:val="0"/>
         <w:color w:val="666666"/>
         <w:sz w:val="16"/>
@@ -6612,7 +6612,7 @@
         <w:ind w:left="1440" w:hanging="360"/>
       </w:pPr>
       <w:rPr>
-        <w:rFonts w:ascii="Symbol" w:hAnsi="Symbol" w:hint="default"/>
+        <w:rFonts w:ascii="NanumGothic" w:hAnsi="NanumGothic" w:eastAsia="NanumGothic" w:cs="NanumGothic"/>
       </w:rPr>
     </w:lvl>
   </w:abstractNum>
@@ -6633,7 +6633,7 @@
         <w:ind w:left="1080" w:hanging="360"/>
       </w:pPr>
       <w:rPr>
-        <w:rFonts w:ascii="Symbol" w:hAnsi="Symbol" w:hint="default"/>
+        <w:rFonts w:ascii="NanumGothic" w:hAnsi="NanumGothic" w:eastAsia="NanumGothic" w:cs="NanumGothic"/>
       </w:rPr>
     </w:lvl>
   </w:abstractNum>
@@ -6654,7 +6654,7 @@
         <w:ind w:left="720" w:hanging="360"/>
       </w:pPr>
       <w:rPr>
-        <w:rFonts w:ascii="Symbol" w:hAnsi="Symbol" w:hint="default"/>
+        <w:rFonts w:ascii="NanumGothic" w:hAnsi="NanumGothic" w:eastAsia="NanumGothic" w:cs="NanumGothic"/>
       </w:rPr>
     </w:lvl>
   </w:abstractNum>
@@ -6693,7 +6693,7 @@
         <w:ind w:left="360" w:hanging="360"/>
       </w:pPr>
       <w:rPr>
-        <w:rFonts w:ascii="Symbol" w:hAnsi="Symbol" w:hint="default"/>
+        <w:rFonts w:ascii="NanumGothic" w:hAnsi="NanumGothic" w:eastAsia="NanumGothic" w:cs="NanumGothic"/>
       </w:rPr>
     </w:lvl>
   </w:abstractNum>
@@ -6732,7 +6732,7 @@
   <w:docDefaults>
     <w:rPrDefault>
       <w:rPr>
-        <w:rFonts w:asciiTheme="minorHAnsi" w:eastAsiaTheme="minorEastAsia" w:hAnsiTheme="minorHAnsi" w:cstheme="minorBidi"/>
+        <w:rFonts w:ascii="NanumGothic" w:hAnsi="NanumGothic" w:eastAsia="NanumGothic" w:cs="NanumGothic"/>
         <w:sz w:val="22"/>
         <w:szCs w:val="22"/>
         <w:lang w:val="en-US" w:eastAsia="en-US" w:bidi="ar-SA"/>
@@ -6891,7 +6891,7 @@
       <w:spacing w:before="0" w:after="100" w:line="278" w:lineRule="auto"/>
     </w:pPr>
     <w:rPr>
-      <w:rFonts w:ascii="Noto Sans KR" w:hAnsi="Noto Sans KR" w:eastAsia="Noto Sans KR"/>
+      <w:rFonts w:ascii="NanumGothic" w:hAnsi="NanumGothic" w:eastAsia="NanumGothic" w:cs="NanumGothic"/>
       <w:b w:val="0"/>
       <w:color w:val="000000"/>
       <w:sz w:val="21"/>
@@ -6956,7 +6956,7 @@
       <w:outlineLvl w:val="0"/>
     </w:pPr>
     <w:rPr>
-      <w:rFonts w:asciiTheme="majorHAnsi" w:eastAsiaTheme="majorEastAsia" w:hAnsiTheme="majorHAnsi" w:cstheme="majorBidi" w:ascii="Noto Sans KR" w:hAnsi="Noto Sans KR" w:eastAsia="Noto Sans KR"/>
+      <w:rFonts w:ascii="NanumGothic" w:hAnsi="NanumGothic" w:eastAsia="NanumGothic" w:cs="NanumGothic"/>
       <w:b/>
       <w:bCs/>
       <w:color w:val="000000"/>
@@ -6980,7 +6980,7 @@
       <w:outlineLvl w:val="1"/>
     </w:pPr>
     <w:rPr>
-      <w:rFonts w:asciiTheme="majorHAnsi" w:eastAsiaTheme="majorEastAsia" w:hAnsiTheme="majorHAnsi" w:cstheme="majorBidi" w:ascii="Noto Sans KR" w:hAnsi="Noto Sans KR" w:eastAsia="Noto Sans KR"/>
+      <w:rFonts w:ascii="NanumGothic" w:hAnsi="NanumGothic" w:eastAsia="NanumGothic" w:cs="NanumGothic"/>
       <w:b/>
       <w:bCs/>
       <w:color w:val="000000"/>
@@ -7004,7 +7004,7 @@
       <w:outlineLvl w:val="2"/>
     </w:pPr>
     <w:rPr>
-      <w:rFonts w:asciiTheme="majorHAnsi" w:eastAsiaTheme="majorEastAsia" w:hAnsiTheme="majorHAnsi" w:cstheme="majorBidi"/>
+      <w:rFonts w:ascii="NanumGothic" w:hAnsi="NanumGothic" w:eastAsia="NanumGothic" w:cs="NanumGothic"/>
       <w:b/>
       <w:bCs/>
       <w:color w:val="4F81BD" w:themeColor="accent1"/>
@@ -7027,7 +7027,7 @@
       <w:outlineLvl w:val="3"/>
     </w:pPr>
     <w:rPr>
-      <w:rFonts w:asciiTheme="majorHAnsi" w:eastAsiaTheme="majorEastAsia" w:hAnsiTheme="majorHAnsi" w:cstheme="majorBidi"/>
+      <w:rFonts w:ascii="NanumGothic" w:hAnsi="NanumGothic" w:eastAsia="NanumGothic" w:cs="NanumGothic"/>
       <w:b/>
       <w:bCs/>
       <w:i/>
@@ -7052,7 +7052,7 @@
       <w:outlineLvl w:val="4"/>
     </w:pPr>
     <w:rPr>
-      <w:rFonts w:asciiTheme="majorHAnsi" w:eastAsiaTheme="majorEastAsia" w:hAnsiTheme="majorHAnsi" w:cstheme="majorBidi"/>
+      <w:rFonts w:ascii="NanumGothic" w:hAnsi="NanumGothic" w:eastAsia="NanumGothic" w:cs="NanumGothic"/>
       <w:color w:val="243F60" w:themeColor="accent1" w:themeShade="7F"/>
     </w:rPr>
   </w:style>
@@ -7073,7 +7073,7 @@
       <w:outlineLvl w:val="5"/>
     </w:pPr>
     <w:rPr>
-      <w:rFonts w:asciiTheme="majorHAnsi" w:eastAsiaTheme="majorEastAsia" w:hAnsiTheme="majorHAnsi" w:cstheme="majorBidi"/>
+      <w:rFonts w:ascii="NanumGothic" w:hAnsi="NanumGothic" w:eastAsia="NanumGothic" w:cs="NanumGothic"/>
       <w:i/>
       <w:iCs/>
       <w:color w:val="243F60" w:themeColor="accent1" w:themeShade="7F"/>
@@ -7096,7 +7096,7 @@
       <w:outlineLvl w:val="6"/>
     </w:pPr>
     <w:rPr>
-      <w:rFonts w:asciiTheme="majorHAnsi" w:eastAsiaTheme="majorEastAsia" w:hAnsiTheme="majorHAnsi" w:cstheme="majorBidi"/>
+      <w:rFonts w:ascii="NanumGothic" w:hAnsi="NanumGothic" w:eastAsia="NanumGothic" w:cs="NanumGothic"/>
       <w:i/>
       <w:iCs/>
       <w:color w:val="404040" w:themeColor="text1" w:themeTint="BF"/>
@@ -7119,7 +7119,7 @@
       <w:outlineLvl w:val="7"/>
     </w:pPr>
     <w:rPr>
-      <w:rFonts w:asciiTheme="majorHAnsi" w:eastAsiaTheme="majorEastAsia" w:hAnsiTheme="majorHAnsi" w:cstheme="majorBidi"/>
+      <w:rFonts w:ascii="NanumGothic" w:hAnsi="NanumGothic" w:eastAsia="NanumGothic" w:cs="NanumGothic"/>
       <w:color w:val="4F81BD" w:themeColor="accent1"/>
       <w:sz w:val="20"/>
       <w:szCs w:val="20"/>
@@ -7142,7 +7142,7 @@
       <w:outlineLvl w:val="8"/>
     </w:pPr>
     <w:rPr>
-      <w:rFonts w:asciiTheme="majorHAnsi" w:eastAsiaTheme="majorEastAsia" w:hAnsiTheme="majorHAnsi" w:cstheme="majorBidi"/>
+      <w:rFonts w:ascii="NanumGothic" w:hAnsi="NanumGothic" w:eastAsia="NanumGothic" w:cs="NanumGothic"/>
       <w:i/>
       <w:iCs/>
       <w:color w:val="404040" w:themeColor="text1" w:themeTint="BF"/>
@@ -7193,7 +7193,7 @@
     <w:uiPriority w:val="9"/>
     <w:rsid w:val="00FC693F"/>
     <w:rPr>
-      <w:rFonts w:asciiTheme="majorHAnsi" w:eastAsiaTheme="majorEastAsia" w:hAnsiTheme="majorHAnsi" w:cstheme="majorBidi"/>
+      <w:rFonts w:ascii="NanumGothic" w:hAnsi="NanumGothic" w:eastAsia="NanumGothic" w:cs="NanumGothic"/>
       <w:b/>
       <w:bCs/>
       <w:color w:val="365F91" w:themeColor="accent1" w:themeShade="BF"/>
@@ -7208,7 +7208,7 @@
     <w:uiPriority w:val="9"/>
     <w:rsid w:val="00FC693F"/>
     <w:rPr>
-      <w:rFonts w:asciiTheme="majorHAnsi" w:eastAsiaTheme="majorEastAsia" w:hAnsiTheme="majorHAnsi" w:cstheme="majorBidi"/>
+      <w:rFonts w:ascii="NanumGothic" w:hAnsi="NanumGothic" w:eastAsia="NanumGothic" w:cs="NanumGothic"/>
       <w:b/>
       <w:bCs/>
       <w:color w:val="4F81BD" w:themeColor="accent1"/>
@@ -7223,7 +7223,7 @@
     <w:uiPriority w:val="9"/>
     <w:rsid w:val="00FC693F"/>
     <w:rPr>
-      <w:rFonts w:asciiTheme="majorHAnsi" w:eastAsiaTheme="majorEastAsia" w:hAnsiTheme="majorHAnsi" w:cstheme="majorBidi"/>
+      <w:rFonts w:ascii="NanumGothic" w:hAnsi="NanumGothic" w:eastAsia="NanumGothic" w:cs="NanumGothic"/>
       <w:b/>
       <w:bCs/>
       <w:color w:val="4F81BD" w:themeColor="accent1"/>
@@ -7242,7 +7242,7 @@
       <w:contextualSpacing/>
     </w:pPr>
     <w:rPr>
-      <w:rFonts w:asciiTheme="majorHAnsi" w:eastAsiaTheme="majorEastAsia" w:hAnsiTheme="majorHAnsi" w:cstheme="majorBidi" w:ascii="Noto Sans KR" w:hAnsi="Noto Sans KR" w:eastAsia="Noto Sans KR"/>
+      <w:rFonts w:ascii="NanumGothic" w:hAnsi="NanumGothic" w:eastAsia="NanumGothic" w:cs="NanumGothic"/>
       <w:b/>
       <w:color w:val="000000"/>
       <w:spacing w:val="5"/>
@@ -7258,7 +7258,7 @@
     <w:uiPriority w:val="10"/>
     <w:rsid w:val="00FC693F"/>
     <w:rPr>
-      <w:rFonts w:asciiTheme="majorHAnsi" w:eastAsiaTheme="majorEastAsia" w:hAnsiTheme="majorHAnsi" w:cstheme="majorBidi"/>
+      <w:rFonts w:ascii="NanumGothic" w:hAnsi="NanumGothic" w:eastAsia="NanumGothic" w:cs="NanumGothic"/>
       <w:color w:val="17365D" w:themeColor="text2" w:themeShade="BF"/>
       <w:spacing w:val="5"/>
       <w:kern w:val="28"/>
@@ -7281,7 +7281,7 @@
       <w:spacing w:before="0" w:after="300"/>
     </w:pPr>
     <w:rPr>
-      <w:rFonts w:asciiTheme="majorHAnsi" w:eastAsiaTheme="majorEastAsia" w:hAnsiTheme="majorHAnsi" w:cstheme="majorBidi" w:ascii="Noto Sans KR" w:hAnsi="Noto Sans KR" w:eastAsia="Noto Sans KR"/>
+      <w:rFonts w:ascii="NanumGothic" w:hAnsi="NanumGothic" w:eastAsia="NanumGothic" w:cs="NanumGothic"/>
       <w:b w:val="0"/>
       <w:i/>
       <w:iCs/>
@@ -7298,7 +7298,7 @@
     <w:uiPriority w:val="11"/>
     <w:rsid w:val="00FC693F"/>
     <w:rPr>
-      <w:rFonts w:asciiTheme="majorHAnsi" w:eastAsiaTheme="majorEastAsia" w:hAnsiTheme="majorHAnsi" w:cstheme="majorBidi"/>
+      <w:rFonts w:ascii="NanumGothic" w:hAnsi="NanumGothic" w:eastAsia="NanumGothic" w:cs="NanumGothic"/>
       <w:i/>
       <w:iCs/>
       <w:color w:val="4F81BD" w:themeColor="accent1"/>
@@ -7329,7 +7329,7 @@
       <w:spacing w:after="120" w:before="0" w:line="278" w:lineRule="auto"/>
     </w:pPr>
     <w:rPr>
-      <w:rFonts w:ascii="Noto Sans KR" w:hAnsi="Noto Sans KR" w:eastAsia="Noto Sans KR"/>
+      <w:rFonts w:ascii="NanumGothic" w:hAnsi="NanumGothic" w:eastAsia="NanumGothic" w:cs="NanumGothic"/>
       <w:b w:val="0"/>
       <w:color w:val="000000"/>
       <w:sz w:val="21"/>
@@ -7551,7 +7551,7 @@
       </w:tabs>
     </w:pPr>
     <w:rPr>
-      <w:rFonts w:ascii="Courier" w:hAnsi="Courier"/>
+      <w:rFonts w:ascii="NanumGothic" w:hAnsi="NanumGothic" w:eastAsia="NanumGothic" w:cs="NanumGothic"/>
       <w:sz w:val="20"/>
       <w:szCs w:val="20"/>
     </w:rPr>
@@ -7563,7 +7563,7 @@
     <w:uiPriority w:val="99"/>
     <w:rsid w:val="0029639D"/>
     <w:rPr>
-      <w:rFonts w:ascii="Courier" w:hAnsi="Courier"/>
+      <w:rFonts w:ascii="NanumGothic" w:hAnsi="NanumGothic" w:eastAsia="NanumGothic" w:cs="NanumGothic"/>
       <w:sz w:val="20"/>
       <w:szCs w:val="20"/>
     </w:rPr>
@@ -7602,7 +7602,7 @@
     <w:semiHidden/>
     <w:rsid w:val="00FC693F"/>
     <w:rPr>
-      <w:rFonts w:asciiTheme="majorHAnsi" w:eastAsiaTheme="majorEastAsia" w:hAnsiTheme="majorHAnsi" w:cstheme="majorBidi"/>
+      <w:rFonts w:ascii="NanumGothic" w:hAnsi="NanumGothic" w:eastAsia="NanumGothic" w:cs="NanumGothic"/>
       <w:b/>
       <w:bCs/>
       <w:i/>
@@ -7618,7 +7618,7 @@
     <w:semiHidden/>
     <w:rsid w:val="00FC693F"/>
     <w:rPr>
-      <w:rFonts w:asciiTheme="majorHAnsi" w:eastAsiaTheme="majorEastAsia" w:hAnsiTheme="majorHAnsi" w:cstheme="majorBidi"/>
+      <w:rFonts w:ascii="NanumGothic" w:hAnsi="NanumGothic" w:eastAsia="NanumGothic" w:cs="NanumGothic"/>
       <w:color w:val="243F60" w:themeColor="accent1" w:themeShade="7F"/>
     </w:rPr>
   </w:style>
@@ -7630,7 +7630,7 @@
     <w:semiHidden/>
     <w:rsid w:val="00FC693F"/>
     <w:rPr>
-      <w:rFonts w:asciiTheme="majorHAnsi" w:eastAsiaTheme="majorEastAsia" w:hAnsiTheme="majorHAnsi" w:cstheme="majorBidi"/>
+      <w:rFonts w:ascii="NanumGothic" w:hAnsi="NanumGothic" w:eastAsia="NanumGothic" w:cs="NanumGothic"/>
       <w:i/>
       <w:iCs/>
       <w:color w:val="243F60" w:themeColor="accent1" w:themeShade="7F"/>
@@ -7644,7 +7644,7 @@
     <w:semiHidden/>
     <w:rsid w:val="00FC693F"/>
     <w:rPr>
-      <w:rFonts w:asciiTheme="majorHAnsi" w:eastAsiaTheme="majorEastAsia" w:hAnsiTheme="majorHAnsi" w:cstheme="majorBidi"/>
+      <w:rFonts w:ascii="NanumGothic" w:hAnsi="NanumGothic" w:eastAsia="NanumGothic" w:cs="NanumGothic"/>
       <w:i/>
       <w:iCs/>
       <w:color w:val="404040" w:themeColor="text1" w:themeTint="BF"/>
@@ -7658,7 +7658,7 @@
     <w:semiHidden/>
     <w:rsid w:val="00FC693F"/>
     <w:rPr>
-      <w:rFonts w:asciiTheme="majorHAnsi" w:eastAsiaTheme="majorEastAsia" w:hAnsiTheme="majorHAnsi" w:cstheme="majorBidi"/>
+      <w:rFonts w:ascii="NanumGothic" w:hAnsi="NanumGothic" w:eastAsia="NanumGothic" w:cs="NanumGothic"/>
       <w:color w:val="4F81BD" w:themeColor="accent1"/>
       <w:sz w:val="20"/>
       <w:szCs w:val="20"/>
@@ -7672,7 +7672,7 @@
     <w:semiHidden/>
     <w:rsid w:val="00FC693F"/>
     <w:rPr>
-      <w:rFonts w:asciiTheme="majorHAnsi" w:eastAsiaTheme="majorEastAsia" w:hAnsiTheme="majorHAnsi" w:cstheme="majorBidi"/>
+      <w:rFonts w:ascii="NanumGothic" w:hAnsi="NanumGothic" w:eastAsia="NanumGothic" w:cs="NanumGothic"/>
       <w:i/>
       <w:iCs/>
       <w:color w:val="404040" w:themeColor="text1" w:themeTint="BF"/>
@@ -9261,7 +9261,7 @@
         <w:spacing w:before="0" w:after="0" w:line="240" w:lineRule="auto"/>
       </w:pPr>
       <w:rPr>
-        <w:rFonts w:asciiTheme="majorHAnsi" w:eastAsiaTheme="majorEastAsia" w:hAnsiTheme="majorHAnsi" w:cstheme="majorBidi"/>
+        <w:rFonts w:ascii="NanumGothic" w:hAnsi="NanumGothic" w:eastAsia="NanumGothic" w:cs="NanumGothic"/>
         <w:b/>
         <w:bCs/>
       </w:rPr>
@@ -9282,7 +9282,7 @@
         <w:spacing w:before="0" w:after="0" w:line="240" w:lineRule="auto"/>
       </w:pPr>
       <w:rPr>
-        <w:rFonts w:asciiTheme="majorHAnsi" w:eastAsiaTheme="majorEastAsia" w:hAnsiTheme="majorHAnsi" w:cstheme="majorBidi"/>
+        <w:rFonts w:ascii="NanumGothic" w:hAnsi="NanumGothic" w:eastAsia="NanumGothic" w:cs="NanumGothic"/>
         <w:b/>
         <w:bCs/>
       </w:rPr>
@@ -9300,14 +9300,14 @@
     </w:tblStylePr>
     <w:tblStylePr w:type="firstCol">
       <w:rPr>
-        <w:rFonts w:asciiTheme="majorHAnsi" w:eastAsiaTheme="majorEastAsia" w:hAnsiTheme="majorHAnsi" w:cstheme="majorBidi"/>
+        <w:rFonts w:ascii="NanumGothic" w:hAnsi="NanumGothic" w:eastAsia="NanumGothic" w:cs="NanumGothic"/>
         <w:b/>
         <w:bCs/>
       </w:rPr>
     </w:tblStylePr>
     <w:tblStylePr w:type="lastCol">
       <w:rPr>
-        <w:rFonts w:asciiTheme="majorHAnsi" w:eastAsiaTheme="majorEastAsia" w:hAnsiTheme="majorHAnsi" w:cstheme="majorBidi"/>
+        <w:rFonts w:ascii="NanumGothic" w:hAnsi="NanumGothic" w:eastAsia="NanumGothic" w:cs="NanumGothic"/>
         <w:b/>
         <w:bCs/>
       </w:rPr>
@@ -9391,7 +9391,7 @@
         <w:spacing w:before="0" w:after="0" w:line="240" w:lineRule="auto"/>
       </w:pPr>
       <w:rPr>
-        <w:rFonts w:asciiTheme="majorHAnsi" w:eastAsiaTheme="majorEastAsia" w:hAnsiTheme="majorHAnsi" w:cstheme="majorBidi"/>
+        <w:rFonts w:ascii="NanumGothic" w:hAnsi="NanumGothic" w:eastAsia="NanumGothic" w:cs="NanumGothic"/>
         <w:b/>
         <w:bCs/>
       </w:rPr>
@@ -9412,7 +9412,7 @@
         <w:spacing w:before="0" w:after="0" w:line="240" w:lineRule="auto"/>
       </w:pPr>
       <w:rPr>
-        <w:rFonts w:asciiTheme="majorHAnsi" w:eastAsiaTheme="majorEastAsia" w:hAnsiTheme="majorHAnsi" w:cstheme="majorBidi"/>
+        <w:rFonts w:ascii="NanumGothic" w:hAnsi="NanumGothic" w:eastAsia="NanumGothic" w:cs="NanumGothic"/>
         <w:b/>
         <w:bCs/>
       </w:rPr>
@@ -9430,14 +9430,14 @@
     </w:tblStylePr>
     <w:tblStylePr w:type="firstCol">
       <w:rPr>
-        <w:rFonts w:asciiTheme="majorHAnsi" w:eastAsiaTheme="majorEastAsia" w:hAnsiTheme="majorHAnsi" w:cstheme="majorBidi"/>
+        <w:rFonts w:ascii="NanumGothic" w:hAnsi="NanumGothic" w:eastAsia="NanumGothic" w:cs="NanumGothic"/>
         <w:b/>
         <w:bCs/>
       </w:rPr>
     </w:tblStylePr>
     <w:tblStylePr w:type="lastCol">
       <w:rPr>
-        <w:rFonts w:asciiTheme="majorHAnsi" w:eastAsiaTheme="majorEastAsia" w:hAnsiTheme="majorHAnsi" w:cstheme="majorBidi"/>
+        <w:rFonts w:ascii="NanumGothic" w:hAnsi="NanumGothic" w:eastAsia="NanumGothic" w:cs="NanumGothic"/>
         <w:b/>
         <w:bCs/>
       </w:rPr>
@@ -9521,7 +9521,7 @@
         <w:spacing w:before="0" w:after="0" w:line="240" w:lineRule="auto"/>
       </w:pPr>
       <w:rPr>
-        <w:rFonts w:asciiTheme="majorHAnsi" w:eastAsiaTheme="majorEastAsia" w:hAnsiTheme="majorHAnsi" w:cstheme="majorBidi"/>
+        <w:rFonts w:ascii="NanumGothic" w:hAnsi="NanumGothic" w:eastAsia="NanumGothic" w:cs="NanumGothic"/>
         <w:b/>
         <w:bCs/>
       </w:rPr>
@@ -9542,7 +9542,7 @@
         <w:spacing w:before="0" w:after="0" w:line="240" w:lineRule="auto"/>
       </w:pPr>
       <w:rPr>
-        <w:rFonts w:asciiTheme="majorHAnsi" w:eastAsiaTheme="majorEastAsia" w:hAnsiTheme="majorHAnsi" w:cstheme="majorBidi"/>
+        <w:rFonts w:ascii="NanumGothic" w:hAnsi="NanumGothic" w:eastAsia="NanumGothic" w:cs="NanumGothic"/>
         <w:b/>
         <w:bCs/>
       </w:rPr>
@@ -9560,14 +9560,14 @@
     </w:tblStylePr>
     <w:tblStylePr w:type="firstCol">
       <w:rPr>
-        <w:rFonts w:asciiTheme="majorHAnsi" w:eastAsiaTheme="majorEastAsia" w:hAnsiTheme="majorHAnsi" w:cstheme="majorBidi"/>
+        <w:rFonts w:ascii="NanumGothic" w:hAnsi="NanumGothic" w:eastAsia="NanumGothic" w:cs="NanumGothic"/>
         <w:b/>
         <w:bCs/>
       </w:rPr>
     </w:tblStylePr>
     <w:tblStylePr w:type="lastCol">
       <w:rPr>
-        <w:rFonts w:asciiTheme="majorHAnsi" w:eastAsiaTheme="majorEastAsia" w:hAnsiTheme="majorHAnsi" w:cstheme="majorBidi"/>
+        <w:rFonts w:ascii="NanumGothic" w:hAnsi="NanumGothic" w:eastAsia="NanumGothic" w:cs="NanumGothic"/>
         <w:b/>
         <w:bCs/>
       </w:rPr>
@@ -9651,7 +9651,7 @@
         <w:spacing w:before="0" w:after="0" w:line="240" w:lineRule="auto"/>
       </w:pPr>
       <w:rPr>
-        <w:rFonts w:asciiTheme="majorHAnsi" w:eastAsiaTheme="majorEastAsia" w:hAnsiTheme="majorHAnsi" w:cstheme="majorBidi"/>
+        <w:rFonts w:ascii="NanumGothic" w:hAnsi="NanumGothic" w:eastAsia="NanumGothic" w:cs="NanumGothic"/>
         <w:b/>
         <w:bCs/>
       </w:rPr>
@@ -9672,7 +9672,7 @@
         <w:spacing w:before="0" w:after="0" w:line="240" w:lineRule="auto"/>
       </w:pPr>
       <w:rPr>
-        <w:rFonts w:asciiTheme="majorHAnsi" w:eastAsiaTheme="majorEastAsia" w:hAnsiTheme="majorHAnsi" w:cstheme="majorBidi"/>
+        <w:rFonts w:ascii="NanumGothic" w:hAnsi="NanumGothic" w:eastAsia="NanumGothic" w:cs="NanumGothic"/>
         <w:b/>
         <w:bCs/>
       </w:rPr>
@@ -9690,14 +9690,14 @@
     </w:tblStylePr>
     <w:tblStylePr w:type="firstCol">
       <w:rPr>
-        <w:rFonts w:asciiTheme="majorHAnsi" w:eastAsiaTheme="majorEastAsia" w:hAnsiTheme="majorHAnsi" w:cstheme="majorBidi"/>
+        <w:rFonts w:ascii="NanumGothic" w:hAnsi="NanumGothic" w:eastAsia="NanumGothic" w:cs="NanumGothic"/>
         <w:b/>
         <w:bCs/>
       </w:rPr>
     </w:tblStylePr>
     <w:tblStylePr w:type="lastCol">
       <w:rPr>
-        <w:rFonts w:asciiTheme="majorHAnsi" w:eastAsiaTheme="majorEastAsia" w:hAnsiTheme="majorHAnsi" w:cstheme="majorBidi"/>
+        <w:rFonts w:ascii="NanumGothic" w:hAnsi="NanumGothic" w:eastAsia="NanumGothic" w:cs="NanumGothic"/>
         <w:b/>
         <w:bCs/>
       </w:rPr>
@@ -9781,7 +9781,7 @@
         <w:spacing w:before="0" w:after="0" w:line="240" w:lineRule="auto"/>
       </w:pPr>
       <w:rPr>
-        <w:rFonts w:asciiTheme="majorHAnsi" w:eastAsiaTheme="majorEastAsia" w:hAnsiTheme="majorHAnsi" w:cstheme="majorBidi"/>
+        <w:rFonts w:ascii="NanumGothic" w:hAnsi="NanumGothic" w:eastAsia="NanumGothic" w:cs="NanumGothic"/>
         <w:b/>
         <w:bCs/>
       </w:rPr>
@@ -9802,7 +9802,7 @@
         <w:spacing w:before="0" w:after="0" w:line="240" w:lineRule="auto"/>
       </w:pPr>
       <w:rPr>
-        <w:rFonts w:asciiTheme="majorHAnsi" w:eastAsiaTheme="majorEastAsia" w:hAnsiTheme="majorHAnsi" w:cstheme="majorBidi"/>
+        <w:rFonts w:ascii="NanumGothic" w:hAnsi="NanumGothic" w:eastAsia="NanumGothic" w:cs="NanumGothic"/>
         <w:b/>
         <w:bCs/>
       </w:rPr>
@@ -9820,14 +9820,14 @@
     </w:tblStylePr>
     <w:tblStylePr w:type="firstCol">
       <w:rPr>
-        <w:rFonts w:asciiTheme="majorHAnsi" w:eastAsiaTheme="majorEastAsia" w:hAnsiTheme="majorHAnsi" w:cstheme="majorBidi"/>
+        <w:rFonts w:ascii="NanumGothic" w:hAnsi="NanumGothic" w:eastAsia="NanumGothic" w:cs="NanumGothic"/>
         <w:b/>
         <w:bCs/>
       </w:rPr>
     </w:tblStylePr>
     <w:tblStylePr w:type="lastCol">
       <w:rPr>
-        <w:rFonts w:asciiTheme="majorHAnsi" w:eastAsiaTheme="majorEastAsia" w:hAnsiTheme="majorHAnsi" w:cstheme="majorBidi"/>
+        <w:rFonts w:ascii="NanumGothic" w:hAnsi="NanumGothic" w:eastAsia="NanumGothic" w:cs="NanumGothic"/>
         <w:b/>
         <w:bCs/>
       </w:rPr>
@@ -9911,7 +9911,7 @@
         <w:spacing w:before="0" w:after="0" w:line="240" w:lineRule="auto"/>
       </w:pPr>
       <w:rPr>
-        <w:rFonts w:asciiTheme="majorHAnsi" w:eastAsiaTheme="majorEastAsia" w:hAnsiTheme="majorHAnsi" w:cstheme="majorBidi"/>
+        <w:rFonts w:ascii="NanumGothic" w:hAnsi="NanumGothic" w:eastAsia="NanumGothic" w:cs="NanumGothic"/>
         <w:b/>
         <w:bCs/>
       </w:rPr>
@@ -9932,7 +9932,7 @@
         <w:spacing w:before="0" w:after="0" w:line="240" w:lineRule="auto"/>
       </w:pPr>
       <w:rPr>
-        <w:rFonts w:asciiTheme="majorHAnsi" w:eastAsiaTheme="majorEastAsia" w:hAnsiTheme="majorHAnsi" w:cstheme="majorBidi"/>
+        <w:rFonts w:ascii="NanumGothic" w:hAnsi="NanumGothic" w:eastAsia="NanumGothic" w:cs="NanumGothic"/>
         <w:b/>
         <w:bCs/>
       </w:rPr>
@@ -9950,14 +9950,14 @@
     </w:tblStylePr>
     <w:tblStylePr w:type="firstCol">
       <w:rPr>
-        <w:rFonts w:asciiTheme="majorHAnsi" w:eastAsiaTheme="majorEastAsia" w:hAnsiTheme="majorHAnsi" w:cstheme="majorBidi"/>
+        <w:rFonts w:ascii="NanumGothic" w:hAnsi="NanumGothic" w:eastAsia="NanumGothic" w:cs="NanumGothic"/>
         <w:b/>
         <w:bCs/>
       </w:rPr>
     </w:tblStylePr>
     <w:tblStylePr w:type="lastCol">
       <w:rPr>
-        <w:rFonts w:asciiTheme="majorHAnsi" w:eastAsiaTheme="majorEastAsia" w:hAnsiTheme="majorHAnsi" w:cstheme="majorBidi"/>
+        <w:rFonts w:ascii="NanumGothic" w:hAnsi="NanumGothic" w:eastAsia="NanumGothic" w:cs="NanumGothic"/>
         <w:b/>
         <w:bCs/>
       </w:rPr>
@@ -10041,7 +10041,7 @@
         <w:spacing w:before="0" w:after="0" w:line="240" w:lineRule="auto"/>
       </w:pPr>
       <w:rPr>
-        <w:rFonts w:asciiTheme="majorHAnsi" w:eastAsiaTheme="majorEastAsia" w:hAnsiTheme="majorHAnsi" w:cstheme="majorBidi"/>
+        <w:rFonts w:ascii="NanumGothic" w:hAnsi="NanumGothic" w:eastAsia="NanumGothic" w:cs="NanumGothic"/>
         <w:b/>
         <w:bCs/>
       </w:rPr>
@@ -10062,7 +10062,7 @@
         <w:spacing w:before="0" w:after="0" w:line="240" w:lineRule="auto"/>
       </w:pPr>
       <w:rPr>
-        <w:rFonts w:asciiTheme="majorHAnsi" w:eastAsiaTheme="majorEastAsia" w:hAnsiTheme="majorHAnsi" w:cstheme="majorBidi"/>
+        <w:rFonts w:ascii="NanumGothic" w:hAnsi="NanumGothic" w:eastAsia="NanumGothic" w:cs="NanumGothic"/>
         <w:b/>
         <w:bCs/>
       </w:rPr>
@@ -10080,14 +10080,14 @@
     </w:tblStylePr>
     <w:tblStylePr w:type="firstCol">
       <w:rPr>
-        <w:rFonts w:asciiTheme="majorHAnsi" w:eastAsiaTheme="majorEastAsia" w:hAnsiTheme="majorHAnsi" w:cstheme="majorBidi"/>
+        <w:rFonts w:ascii="NanumGothic" w:hAnsi="NanumGothic" w:eastAsia="NanumGothic" w:cs="NanumGothic"/>
         <w:b/>
         <w:bCs/>
       </w:rPr>
     </w:tblStylePr>
     <w:tblStylePr w:type="lastCol">
       <w:rPr>
-        <w:rFonts w:asciiTheme="majorHAnsi" w:eastAsiaTheme="majorEastAsia" w:hAnsiTheme="majorHAnsi" w:cstheme="majorBidi"/>
+        <w:rFonts w:ascii="NanumGothic" w:hAnsi="NanumGothic" w:eastAsia="NanumGothic" w:cs="NanumGothic"/>
         <w:b/>
         <w:bCs/>
       </w:rPr>
@@ -11952,7 +11952,7 @@
     </w:tblPr>
     <w:tblStylePr w:type="firstRow">
       <w:rPr>
-        <w:rFonts w:asciiTheme="majorHAnsi" w:eastAsiaTheme="majorEastAsia" w:hAnsiTheme="majorHAnsi" w:cstheme="majorBidi"/>
+        <w:rFonts w:ascii="NanumGothic" w:hAnsi="NanumGothic" w:eastAsia="NanumGothic" w:cs="NanumGothic"/>
       </w:rPr>
       <w:tblPr/>
       <w:tcPr>
@@ -12036,7 +12036,7 @@
     </w:tblPr>
     <w:tblStylePr w:type="firstRow">
       <w:rPr>
-        <w:rFonts w:asciiTheme="majorHAnsi" w:eastAsiaTheme="majorEastAsia" w:hAnsiTheme="majorHAnsi" w:cstheme="majorBidi"/>
+        <w:rFonts w:ascii="NanumGothic" w:hAnsi="NanumGothic" w:eastAsia="NanumGothic" w:cs="NanumGothic"/>
       </w:rPr>
       <w:tblPr/>
       <w:tcPr>
@@ -12120,7 +12120,7 @@
     </w:tblPr>
     <w:tblStylePr w:type="firstRow">
       <w:rPr>
-        <w:rFonts w:asciiTheme="majorHAnsi" w:eastAsiaTheme="majorEastAsia" w:hAnsiTheme="majorHAnsi" w:cstheme="majorBidi"/>
+        <w:rFonts w:ascii="NanumGothic" w:hAnsi="NanumGothic" w:eastAsia="NanumGothic" w:cs="NanumGothic"/>
       </w:rPr>
       <w:tblPr/>
       <w:tcPr>
@@ -12204,7 +12204,7 @@
     </w:tblPr>
     <w:tblStylePr w:type="firstRow">
       <w:rPr>
-        <w:rFonts w:asciiTheme="majorHAnsi" w:eastAsiaTheme="majorEastAsia" w:hAnsiTheme="majorHAnsi" w:cstheme="majorBidi"/>
+        <w:rFonts w:ascii="NanumGothic" w:hAnsi="NanumGothic" w:eastAsia="NanumGothic" w:cs="NanumGothic"/>
       </w:rPr>
       <w:tblPr/>
       <w:tcPr>
@@ -12288,7 +12288,7 @@
     </w:tblPr>
     <w:tblStylePr w:type="firstRow">
       <w:rPr>
-        <w:rFonts w:asciiTheme="majorHAnsi" w:eastAsiaTheme="majorEastAsia" w:hAnsiTheme="majorHAnsi" w:cstheme="majorBidi"/>
+        <w:rFonts w:ascii="NanumGothic" w:hAnsi="NanumGothic" w:eastAsia="NanumGothic" w:cs="NanumGothic"/>
       </w:rPr>
       <w:tblPr/>
       <w:tcPr>
@@ -12372,7 +12372,7 @@
     </w:tblPr>
     <w:tblStylePr w:type="firstRow">
       <w:rPr>
-        <w:rFonts w:asciiTheme="majorHAnsi" w:eastAsiaTheme="majorEastAsia" w:hAnsiTheme="majorHAnsi" w:cstheme="majorBidi"/>
+        <w:rFonts w:ascii="NanumGothic" w:hAnsi="NanumGothic" w:eastAsia="NanumGothic" w:cs="NanumGothic"/>
       </w:rPr>
       <w:tblPr/>
       <w:tcPr>
@@ -12456,7 +12456,7 @@
     </w:tblPr>
     <w:tblStylePr w:type="firstRow">
       <w:rPr>
-        <w:rFonts w:asciiTheme="majorHAnsi" w:eastAsiaTheme="majorEastAsia" w:hAnsiTheme="majorHAnsi" w:cstheme="majorBidi"/>
+        <w:rFonts w:ascii="NanumGothic" w:hAnsi="NanumGothic" w:eastAsia="NanumGothic" w:cs="NanumGothic"/>
       </w:rPr>
       <w:tblPr/>
       <w:tcPr>
@@ -12521,7 +12521,7 @@
       <w:spacing w:after="0" w:line="240" w:lineRule="auto"/>
     </w:pPr>
     <w:rPr>
-      <w:rFonts w:asciiTheme="majorHAnsi" w:eastAsiaTheme="majorEastAsia" w:hAnsiTheme="majorHAnsi" w:cstheme="majorBidi"/>
+      <w:rFonts w:ascii="NanumGothic" w:hAnsi="NanumGothic" w:eastAsia="NanumGothic" w:cs="NanumGothic"/>
       <w:color w:val="000000" w:themeColor="text1"/>
     </w:rPr>
     <w:tblPr>
@@ -12649,7 +12649,7 @@
       <w:spacing w:after="0" w:line="240" w:lineRule="auto"/>
     </w:pPr>
     <w:rPr>
-      <w:rFonts w:asciiTheme="majorHAnsi" w:eastAsiaTheme="majorEastAsia" w:hAnsiTheme="majorHAnsi" w:cstheme="majorBidi"/>
+      <w:rFonts w:ascii="NanumGothic" w:hAnsi="NanumGothic" w:eastAsia="NanumGothic" w:cs="NanumGothic"/>
       <w:color w:val="000000" w:themeColor="text1"/>
     </w:rPr>
     <w:tblPr>
@@ -12777,7 +12777,7 @@
       <w:spacing w:after="0" w:line="240" w:lineRule="auto"/>
     </w:pPr>
     <w:rPr>
-      <w:rFonts w:asciiTheme="majorHAnsi" w:eastAsiaTheme="majorEastAsia" w:hAnsiTheme="majorHAnsi" w:cstheme="majorBidi"/>
+      <w:rFonts w:ascii="NanumGothic" w:hAnsi="NanumGothic" w:eastAsia="NanumGothic" w:cs="NanumGothic"/>
       <w:color w:val="000000" w:themeColor="text1"/>
     </w:rPr>
     <w:tblPr>
@@ -12905,7 +12905,7 @@
       <w:spacing w:after="0" w:line="240" w:lineRule="auto"/>
     </w:pPr>
     <w:rPr>
-      <w:rFonts w:asciiTheme="majorHAnsi" w:eastAsiaTheme="majorEastAsia" w:hAnsiTheme="majorHAnsi" w:cstheme="majorBidi"/>
+      <w:rFonts w:ascii="NanumGothic" w:hAnsi="NanumGothic" w:eastAsia="NanumGothic" w:cs="NanumGothic"/>
       <w:color w:val="000000" w:themeColor="text1"/>
     </w:rPr>
     <w:tblPr>
@@ -13033,7 +13033,7 @@
       <w:spacing w:after="0" w:line="240" w:lineRule="auto"/>
     </w:pPr>
     <w:rPr>
-      <w:rFonts w:asciiTheme="majorHAnsi" w:eastAsiaTheme="majorEastAsia" w:hAnsiTheme="majorHAnsi" w:cstheme="majorBidi"/>
+      <w:rFonts w:ascii="NanumGothic" w:hAnsi="NanumGothic" w:eastAsia="NanumGothic" w:cs="NanumGothic"/>
       <w:color w:val="000000" w:themeColor="text1"/>
     </w:rPr>
     <w:tblPr>
@@ -13161,7 +13161,7 @@
       <w:spacing w:after="0" w:line="240" w:lineRule="auto"/>
     </w:pPr>
     <w:rPr>
-      <w:rFonts w:asciiTheme="majorHAnsi" w:eastAsiaTheme="majorEastAsia" w:hAnsiTheme="majorHAnsi" w:cstheme="majorBidi"/>
+      <w:rFonts w:ascii="NanumGothic" w:hAnsi="NanumGothic" w:eastAsia="NanumGothic" w:cs="NanumGothic"/>
       <w:color w:val="000000" w:themeColor="text1"/>
     </w:rPr>
     <w:tblPr>
@@ -13289,7 +13289,7 @@
       <w:spacing w:after="0" w:line="240" w:lineRule="auto"/>
     </w:pPr>
     <w:rPr>
-      <w:rFonts w:asciiTheme="majorHAnsi" w:eastAsiaTheme="majorEastAsia" w:hAnsiTheme="majorHAnsi" w:cstheme="majorBidi"/>
+      <w:rFonts w:ascii="NanumGothic" w:hAnsi="NanumGothic" w:eastAsia="NanumGothic" w:cs="NanumGothic"/>
       <w:color w:val="000000" w:themeColor="text1"/>
     </w:rPr>
     <w:tblPr>
@@ -13928,7 +13928,7 @@
       <w:spacing w:after="0" w:line="240" w:lineRule="auto"/>
     </w:pPr>
     <w:rPr>
-      <w:rFonts w:asciiTheme="majorHAnsi" w:eastAsiaTheme="majorEastAsia" w:hAnsiTheme="majorHAnsi" w:cstheme="majorBidi"/>
+      <w:rFonts w:ascii="NanumGothic" w:hAnsi="NanumGothic" w:eastAsia="NanumGothic" w:cs="NanumGothic"/>
       <w:color w:val="000000" w:themeColor="text1"/>
     </w:rPr>
     <w:tblPr>
@@ -14053,7 +14053,7 @@
       <w:spacing w:after="0" w:line="240" w:lineRule="auto"/>
     </w:pPr>
     <w:rPr>
-      <w:rFonts w:asciiTheme="majorHAnsi" w:eastAsiaTheme="majorEastAsia" w:hAnsiTheme="majorHAnsi" w:cstheme="majorBidi"/>
+      <w:rFonts w:ascii="NanumGothic" w:hAnsi="NanumGothic" w:eastAsia="NanumGothic" w:cs="NanumGothic"/>
       <w:color w:val="000000" w:themeColor="text1"/>
     </w:rPr>
     <w:tblPr>
@@ -14178,7 +14178,7 @@
       <w:spacing w:after="0" w:line="240" w:lineRule="auto"/>
     </w:pPr>
     <w:rPr>
-      <w:rFonts w:asciiTheme="majorHAnsi" w:eastAsiaTheme="majorEastAsia" w:hAnsiTheme="majorHAnsi" w:cstheme="majorBidi"/>
+      <w:rFonts w:ascii="NanumGothic" w:hAnsi="NanumGothic" w:eastAsia="NanumGothic" w:cs="NanumGothic"/>
       <w:color w:val="000000" w:themeColor="text1"/>
     </w:rPr>
     <w:tblPr>
@@ -14303,7 +14303,7 @@
       <w:spacing w:after="0" w:line="240" w:lineRule="auto"/>
     </w:pPr>
     <w:rPr>
-      <w:rFonts w:asciiTheme="majorHAnsi" w:eastAsiaTheme="majorEastAsia" w:hAnsiTheme="majorHAnsi" w:cstheme="majorBidi"/>
+      <w:rFonts w:ascii="NanumGothic" w:hAnsi="NanumGothic" w:eastAsia="NanumGothic" w:cs="NanumGothic"/>
       <w:color w:val="000000" w:themeColor="text1"/>
     </w:rPr>
     <w:tblPr>
@@ -14428,7 +14428,7 @@
       <w:spacing w:after="0" w:line="240" w:lineRule="auto"/>
     </w:pPr>
     <w:rPr>
-      <w:rFonts w:asciiTheme="majorHAnsi" w:eastAsiaTheme="majorEastAsia" w:hAnsiTheme="majorHAnsi" w:cstheme="majorBidi"/>
+      <w:rFonts w:ascii="NanumGothic" w:hAnsi="NanumGothic" w:eastAsia="NanumGothic" w:cs="NanumGothic"/>
       <w:color w:val="000000" w:themeColor="text1"/>
     </w:rPr>
     <w:tblPr>
@@ -14553,7 +14553,7 @@
       <w:spacing w:after="0" w:line="240" w:lineRule="auto"/>
     </w:pPr>
     <w:rPr>
-      <w:rFonts w:asciiTheme="majorHAnsi" w:eastAsiaTheme="majorEastAsia" w:hAnsiTheme="majorHAnsi" w:cstheme="majorBidi"/>
+      <w:rFonts w:ascii="NanumGothic" w:hAnsi="NanumGothic" w:eastAsia="NanumGothic" w:cs="NanumGothic"/>
       <w:color w:val="000000" w:themeColor="text1"/>
     </w:rPr>
     <w:tblPr>
@@ -14678,7 +14678,7 @@
       <w:spacing w:after="0" w:line="240" w:lineRule="auto"/>
     </w:pPr>
     <w:rPr>
-      <w:rFonts w:asciiTheme="majorHAnsi" w:eastAsiaTheme="majorEastAsia" w:hAnsiTheme="majorHAnsi" w:cstheme="majorBidi"/>
+      <w:rFonts w:ascii="NanumGothic" w:hAnsi="NanumGothic" w:eastAsia="NanumGothic" w:cs="NanumGothic"/>
       <w:color w:val="000000" w:themeColor="text1"/>
     </w:rPr>
     <w:tblPr>
@@ -18593,7 +18593,7 @@
   <w:docDefaults>
     <w:rPrDefault>
       <w:rPr>
-        <w:rFonts w:asciiTheme="minorHAnsi" w:eastAsiaTheme="minorEastAsia" w:hAnsiTheme="minorHAnsi" w:cstheme="minorBidi"/>
+        <w:rFonts w:ascii="NanumGothic" w:hAnsi="NanumGothic" w:eastAsia="NanumGothic" w:cs="NanumGothic"/>
         <w:sz w:val="22"/>
         <w:szCs w:val="22"/>
         <w:lang w:val="en-US" w:eastAsia="en-US" w:bidi="ar-SA"/>
@@ -18764,7 +18764,7 @@
       <w:outlineLvl w:val="0"/>
     </w:pPr>
     <w:rPr>
-      <w:rFonts w:asciiTheme="majorHAnsi" w:eastAsiaTheme="majorEastAsia" w:hAnsiTheme="majorHAnsi" w:cstheme="majorBidi"/>
+      <w:rFonts w:ascii="NanumGothic" w:hAnsi="NanumGothic" w:eastAsia="NanumGothic" w:cs="NanumGothic"/>
       <w:b/>
       <w:bCs/>
       <w:color w:val="365F91" w:themeColor="accent1" w:themeShade="BF"/>
@@ -18788,7 +18788,7 @@
       <w:outlineLvl w:val="1"/>
     </w:pPr>
     <w:rPr>
-      <w:rFonts w:asciiTheme="majorHAnsi" w:eastAsiaTheme="majorEastAsia" w:hAnsiTheme="majorHAnsi" w:cstheme="majorBidi"/>
+      <w:rFonts w:ascii="NanumGothic" w:hAnsi="NanumGothic" w:eastAsia="NanumGothic" w:cs="NanumGothic"/>
       <w:b/>
       <w:bCs/>
       <w:color w:val="4F81BD" w:themeColor="accent1"/>
@@ -18812,7 +18812,7 @@
       <w:outlineLvl w:val="2"/>
     </w:pPr>
     <w:rPr>
-      <w:rFonts w:asciiTheme="majorHAnsi" w:eastAsiaTheme="majorEastAsia" w:hAnsiTheme="majorHAnsi" w:cstheme="majorBidi"/>
+      <w:rFonts w:ascii="NanumGothic" w:hAnsi="NanumGothic" w:eastAsia="NanumGothic" w:cs="NanumGothic"/>
       <w:b/>
       <w:bCs/>
       <w:color w:val="4F81BD" w:themeColor="accent1"/>
@@ -18835,7 +18835,7 @@
       <w:outlineLvl w:val="3"/>
     </w:pPr>
     <w:rPr>
-      <w:rFonts w:asciiTheme="majorHAnsi" w:eastAsiaTheme="majorEastAsia" w:hAnsiTheme="majorHAnsi" w:cstheme="majorBidi"/>
+      <w:rFonts w:ascii="NanumGothic" w:hAnsi="NanumGothic" w:eastAsia="NanumGothic" w:cs="NanumGothic"/>
       <w:b/>
       <w:bCs/>
       <w:i/>
@@ -18860,7 +18860,7 @@
       <w:outlineLvl w:val="4"/>
     </w:pPr>
     <w:rPr>
-      <w:rFonts w:asciiTheme="majorHAnsi" w:eastAsiaTheme="majorEastAsia" w:hAnsiTheme="majorHAnsi" w:cstheme="majorBidi"/>
+      <w:rFonts w:ascii="NanumGothic" w:hAnsi="NanumGothic" w:eastAsia="NanumGothic" w:cs="NanumGothic"/>
       <w:color w:val="243F60" w:themeColor="accent1" w:themeShade="7F"/>
     </w:rPr>
   </w:style>
@@ -18881,7 +18881,7 @@
       <w:outlineLvl w:val="5"/>
     </w:pPr>
     <w:rPr>
-      <w:rFonts w:asciiTheme="majorHAnsi" w:eastAsiaTheme="majorEastAsia" w:hAnsiTheme="majorHAnsi" w:cstheme="majorBidi"/>
+      <w:rFonts w:ascii="NanumGothic" w:hAnsi="NanumGothic" w:eastAsia="NanumGothic" w:cs="NanumGothic"/>
       <w:i/>
       <w:iCs/>
       <w:color w:val="243F60" w:themeColor="accent1" w:themeShade="7F"/>
@@ -18904,7 +18904,7 @@
       <w:outlineLvl w:val="6"/>
     </w:pPr>
     <w:rPr>
-      <w:rFonts w:asciiTheme="majorHAnsi" w:eastAsiaTheme="majorEastAsia" w:hAnsiTheme="majorHAnsi" w:cstheme="majorBidi"/>
+      <w:rFonts w:ascii="NanumGothic" w:hAnsi="NanumGothic" w:eastAsia="NanumGothic" w:cs="NanumGothic"/>
       <w:i/>
       <w:iCs/>
       <w:color w:val="404040" w:themeColor="text1" w:themeTint="BF"/>
@@ -18927,7 +18927,7 @@
       <w:outlineLvl w:val="7"/>
     </w:pPr>
     <w:rPr>
-      <w:rFonts w:asciiTheme="majorHAnsi" w:eastAsiaTheme="majorEastAsia" w:hAnsiTheme="majorHAnsi" w:cstheme="majorBidi"/>
+      <w:rFonts w:ascii="NanumGothic" w:hAnsi="NanumGothic" w:eastAsia="NanumGothic" w:cs="NanumGothic"/>
       <w:color w:val="4F81BD" w:themeColor="accent1"/>
       <w:sz w:val="20"/>
       <w:szCs w:val="20"/>
@@ -18950,7 +18950,7 @@
       <w:outlineLvl w:val="8"/>
     </w:pPr>
     <w:rPr>
-      <w:rFonts w:asciiTheme="majorHAnsi" w:eastAsiaTheme="majorEastAsia" w:hAnsiTheme="majorHAnsi" w:cstheme="majorBidi"/>
+      <w:rFonts w:ascii="NanumGothic" w:hAnsi="NanumGothic" w:eastAsia="NanumGothic" w:cs="NanumGothic"/>
       <w:i/>
       <w:iCs/>
       <w:color w:val="404040" w:themeColor="text1" w:themeTint="BF"/>
@@ -19001,7 +19001,7 @@
     <w:uiPriority w:val="9"/>
     <w:rsid w:val="00FC693F"/>
     <w:rPr>
-      <w:rFonts w:asciiTheme="majorHAnsi" w:eastAsiaTheme="majorEastAsia" w:hAnsiTheme="majorHAnsi" w:cstheme="majorBidi"/>
+      <w:rFonts w:ascii="NanumGothic" w:hAnsi="NanumGothic" w:eastAsia="NanumGothic" w:cs="NanumGothic"/>
       <w:b/>
       <w:bCs/>
       <w:color w:val="365F91" w:themeColor="accent1" w:themeShade="BF"/>
@@ -19016,7 +19016,7 @@
     <w:uiPriority w:val="9"/>
     <w:rsid w:val="00FC693F"/>
     <w:rPr>
-      <w:rFonts w:asciiTheme="majorHAnsi" w:eastAsiaTheme="majorEastAsia" w:hAnsiTheme="majorHAnsi" w:cstheme="majorBidi"/>
+      <w:rFonts w:ascii="NanumGothic" w:hAnsi="NanumGothic" w:eastAsia="NanumGothic" w:cs="NanumGothic"/>
       <w:b/>
       <w:bCs/>
       <w:color w:val="4F81BD" w:themeColor="accent1"/>
@@ -19031,7 +19031,7 @@
     <w:uiPriority w:val="9"/>
     <w:rsid w:val="00FC693F"/>
     <w:rPr>
-      <w:rFonts w:asciiTheme="majorHAnsi" w:eastAsiaTheme="majorEastAsia" w:hAnsiTheme="majorHAnsi" w:cstheme="majorBidi"/>
+      <w:rFonts w:ascii="NanumGothic" w:hAnsi="NanumGothic" w:eastAsia="NanumGothic" w:cs="NanumGothic"/>
       <w:b/>
       <w:bCs/>
       <w:color w:val="4F81BD" w:themeColor="accent1"/>
@@ -19053,7 +19053,7 @@
       <w:contextualSpacing/>
     </w:pPr>
     <w:rPr>
-      <w:rFonts w:asciiTheme="majorHAnsi" w:eastAsiaTheme="majorEastAsia" w:hAnsiTheme="majorHAnsi" w:cstheme="majorBidi"/>
+      <w:rFonts w:ascii="NanumGothic" w:hAnsi="NanumGothic" w:eastAsia="NanumGothic" w:cs="NanumGothic"/>
       <w:color w:val="17365D" w:themeColor="text2" w:themeShade="BF"/>
       <w:spacing w:val="5"/>
       <w:kern w:val="28"/>
@@ -19068,7 +19068,7 @@
     <w:uiPriority w:val="10"/>
     <w:rsid w:val="00FC693F"/>
     <w:rPr>
-      <w:rFonts w:asciiTheme="majorHAnsi" w:eastAsiaTheme="majorEastAsia" w:hAnsiTheme="majorHAnsi" w:cstheme="majorBidi"/>
+      <w:rFonts w:ascii="NanumGothic" w:hAnsi="NanumGothic" w:eastAsia="NanumGothic" w:cs="NanumGothic"/>
       <w:color w:val="17365D" w:themeColor="text2" w:themeShade="BF"/>
       <w:spacing w:val="5"/>
       <w:kern w:val="28"/>
@@ -19090,7 +19090,7 @@
       </w:numPr>
     </w:pPr>
     <w:rPr>
-      <w:rFonts w:asciiTheme="majorHAnsi" w:eastAsiaTheme="majorEastAsia" w:hAnsiTheme="majorHAnsi" w:cstheme="majorBidi"/>
+      <w:rFonts w:ascii="NanumGothic" w:hAnsi="NanumGothic" w:eastAsia="NanumGothic" w:cs="NanumGothic"/>
       <w:i/>
       <w:iCs/>
       <w:color w:val="4F81BD" w:themeColor="accent1"/>
@@ -19106,7 +19106,7 @@
     <w:uiPriority w:val="11"/>
     <w:rsid w:val="00FC693F"/>
     <w:rPr>
-      <w:rFonts w:asciiTheme="majorHAnsi" w:eastAsiaTheme="majorEastAsia" w:hAnsiTheme="majorHAnsi" w:cstheme="majorBidi"/>
+      <w:rFonts w:ascii="NanumGothic" w:hAnsi="NanumGothic" w:eastAsia="NanumGothic" w:cs="NanumGothic"/>
       <w:i/>
       <w:iCs/>
       <w:color w:val="4F81BD" w:themeColor="accent1"/>
@@ -19353,7 +19353,7 @@
       </w:tabs>
     </w:pPr>
     <w:rPr>
-      <w:rFonts w:ascii="Courier" w:hAnsi="Courier"/>
+      <w:rFonts w:ascii="NanumGothic" w:hAnsi="NanumGothic" w:eastAsia="NanumGothic" w:cs="NanumGothic"/>
       <w:sz w:val="20"/>
       <w:szCs w:val="20"/>
     </w:rPr>
@@ -19365,7 +19365,7 @@
     <w:uiPriority w:val="99"/>
     <w:rsid w:val="0029639D"/>
     <w:rPr>
-      <w:rFonts w:ascii="Courier" w:hAnsi="Courier"/>
+      <w:rFonts w:ascii="NanumGothic" w:hAnsi="NanumGothic" w:eastAsia="NanumGothic" w:cs="NanumGothic"/>
       <w:sz w:val="20"/>
       <w:szCs w:val="20"/>
     </w:rPr>
@@ -19404,7 +19404,7 @@
     <w:semiHidden/>
     <w:rsid w:val="00FC693F"/>
     <w:rPr>
-      <w:rFonts w:asciiTheme="majorHAnsi" w:eastAsiaTheme="majorEastAsia" w:hAnsiTheme="majorHAnsi" w:cstheme="majorBidi"/>
+      <w:rFonts w:ascii="NanumGothic" w:hAnsi="NanumGothic" w:eastAsia="NanumGothic" w:cs="NanumGothic"/>
       <w:b/>
       <w:bCs/>
       <w:i/>
@@ -19420,7 +19420,7 @@
     <w:semiHidden/>
     <w:rsid w:val="00FC693F"/>
     <w:rPr>
-      <w:rFonts w:asciiTheme="majorHAnsi" w:eastAsiaTheme="majorEastAsia" w:hAnsiTheme="majorHAnsi" w:cstheme="majorBidi"/>
+      <w:rFonts w:ascii="NanumGothic" w:hAnsi="NanumGothic" w:eastAsia="NanumGothic" w:cs="NanumGothic"/>
       <w:color w:val="243F60" w:themeColor="accent1" w:themeShade="7F"/>
     </w:rPr>
   </w:style>
@@ -19432,7 +19432,7 @@
     <w:semiHidden/>
     <w:rsid w:val="00FC693F"/>
     <w:rPr>
-      <w:rFonts w:asciiTheme="majorHAnsi" w:eastAsiaTheme="majorEastAsia" w:hAnsiTheme="majorHAnsi" w:cstheme="majorBidi"/>
+      <w:rFonts w:ascii="NanumGothic" w:hAnsi="NanumGothic" w:eastAsia="NanumGothic" w:cs="NanumGothic"/>
       <w:i/>
       <w:iCs/>
       <w:color w:val="243F60" w:themeColor="accent1" w:themeShade="7F"/>
@@ -19446,7 +19446,7 @@
     <w:semiHidden/>
     <w:rsid w:val="00FC693F"/>
     <w:rPr>
-      <w:rFonts w:asciiTheme="majorHAnsi" w:eastAsiaTheme="majorEastAsia" w:hAnsiTheme="majorHAnsi" w:cstheme="majorBidi"/>
+      <w:rFonts w:ascii="NanumGothic" w:hAnsi="NanumGothic" w:eastAsia="NanumGothic" w:cs="NanumGothic"/>
       <w:i/>
       <w:iCs/>
       <w:color w:val="404040" w:themeColor="text1" w:themeTint="BF"/>
@@ -19460,7 +19460,7 @@
     <w:semiHidden/>
     <w:rsid w:val="00FC693F"/>
     <w:rPr>
-      <w:rFonts w:asciiTheme="majorHAnsi" w:eastAsiaTheme="majorEastAsia" w:hAnsiTheme="majorHAnsi" w:cstheme="majorBidi"/>
+      <w:rFonts w:ascii="NanumGothic" w:hAnsi="NanumGothic" w:eastAsia="NanumGothic" w:cs="NanumGothic"/>
       <w:color w:val="4F81BD" w:themeColor="accent1"/>
       <w:sz w:val="20"/>
       <w:szCs w:val="20"/>
@@ -19474,7 +19474,7 @@
     <w:semiHidden/>
     <w:rsid w:val="00FC693F"/>
     <w:rPr>
-      <w:rFonts w:asciiTheme="majorHAnsi" w:eastAsiaTheme="majorEastAsia" w:hAnsiTheme="majorHAnsi" w:cstheme="majorBidi"/>
+      <w:rFonts w:ascii="NanumGothic" w:hAnsi="NanumGothic" w:eastAsia="NanumGothic" w:cs="NanumGothic"/>
       <w:i/>
       <w:iCs/>
       <w:color w:val="404040" w:themeColor="text1" w:themeTint="BF"/>
@@ -21063,7 +21063,7 @@
         <w:spacing w:before="0" w:after="0" w:line="240" w:lineRule="auto"/>
       </w:pPr>
       <w:rPr>
-        <w:rFonts w:asciiTheme="majorHAnsi" w:eastAsiaTheme="majorEastAsia" w:hAnsiTheme="majorHAnsi" w:cstheme="majorBidi"/>
+        <w:rFonts w:ascii="NanumGothic" w:hAnsi="NanumGothic" w:eastAsia="NanumGothic" w:cs="NanumGothic"/>
         <w:b/>
         <w:bCs/>
       </w:rPr>
@@ -21084,7 +21084,7 @@
         <w:spacing w:before="0" w:after="0" w:line="240" w:lineRule="auto"/>
       </w:pPr>
       <w:rPr>
-        <w:rFonts w:asciiTheme="majorHAnsi" w:eastAsiaTheme="majorEastAsia" w:hAnsiTheme="majorHAnsi" w:cstheme="majorBidi"/>
+        <w:rFonts w:ascii="NanumGothic" w:hAnsi="NanumGothic" w:eastAsia="NanumGothic" w:cs="NanumGothic"/>
         <w:b/>
         <w:bCs/>
       </w:rPr>
@@ -21102,14 +21102,14 @@
     </w:tblStylePr>
     <w:tblStylePr w:type="firstCol">
       <w:rPr>
-        <w:rFonts w:asciiTheme="majorHAnsi" w:eastAsiaTheme="majorEastAsia" w:hAnsiTheme="majorHAnsi" w:cstheme="majorBidi"/>
+        <w:rFonts w:ascii="NanumGothic" w:hAnsi="NanumGothic" w:eastAsia="NanumGothic" w:cs="NanumGothic"/>
         <w:b/>
         <w:bCs/>
       </w:rPr>
     </w:tblStylePr>
     <w:tblStylePr w:type="lastCol">
       <w:rPr>
-        <w:rFonts w:asciiTheme="majorHAnsi" w:eastAsiaTheme="majorEastAsia" w:hAnsiTheme="majorHAnsi" w:cstheme="majorBidi"/>
+        <w:rFonts w:ascii="NanumGothic" w:hAnsi="NanumGothic" w:eastAsia="NanumGothic" w:cs="NanumGothic"/>
         <w:b/>
         <w:bCs/>
       </w:rPr>
@@ -21193,7 +21193,7 @@
         <w:spacing w:before="0" w:after="0" w:line="240" w:lineRule="auto"/>
       </w:pPr>
       <w:rPr>
-        <w:rFonts w:asciiTheme="majorHAnsi" w:eastAsiaTheme="majorEastAsia" w:hAnsiTheme="majorHAnsi" w:cstheme="majorBidi"/>
+        <w:rFonts w:ascii="NanumGothic" w:hAnsi="NanumGothic" w:eastAsia="NanumGothic" w:cs="NanumGothic"/>
         <w:b/>
         <w:bCs/>
       </w:rPr>
@@ -21214,7 +21214,7 @@
         <w:spacing w:before="0" w:after="0" w:line="240" w:lineRule="auto"/>
       </w:pPr>
       <w:rPr>
-        <w:rFonts w:asciiTheme="majorHAnsi" w:eastAsiaTheme="majorEastAsia" w:hAnsiTheme="majorHAnsi" w:cstheme="majorBidi"/>
+        <w:rFonts w:ascii="NanumGothic" w:hAnsi="NanumGothic" w:eastAsia="NanumGothic" w:cs="NanumGothic"/>
         <w:b/>
         <w:bCs/>
       </w:rPr>
@@ -21232,14 +21232,14 @@
     </w:tblStylePr>
     <w:tblStylePr w:type="firstCol">
       <w:rPr>
-        <w:rFonts w:asciiTheme="majorHAnsi" w:eastAsiaTheme="majorEastAsia" w:hAnsiTheme="majorHAnsi" w:cstheme="majorBidi"/>
+        <w:rFonts w:ascii="NanumGothic" w:hAnsi="NanumGothic" w:eastAsia="NanumGothic" w:cs="NanumGothic"/>
         <w:b/>
         <w:bCs/>
       </w:rPr>
     </w:tblStylePr>
     <w:tblStylePr w:type="lastCol">
       <w:rPr>
-        <w:rFonts w:asciiTheme="majorHAnsi" w:eastAsiaTheme="majorEastAsia" w:hAnsiTheme="majorHAnsi" w:cstheme="majorBidi"/>
+        <w:rFonts w:ascii="NanumGothic" w:hAnsi="NanumGothic" w:eastAsia="NanumGothic" w:cs="NanumGothic"/>
         <w:b/>
         <w:bCs/>
       </w:rPr>
@@ -21323,7 +21323,7 @@
         <w:spacing w:before="0" w:after="0" w:line="240" w:lineRule="auto"/>
       </w:pPr>
       <w:rPr>
-        <w:rFonts w:asciiTheme="majorHAnsi" w:eastAsiaTheme="majorEastAsia" w:hAnsiTheme="majorHAnsi" w:cstheme="majorBidi"/>
+        <w:rFonts w:ascii="NanumGothic" w:hAnsi="NanumGothic" w:eastAsia="NanumGothic" w:cs="NanumGothic"/>
         <w:b/>
         <w:bCs/>
       </w:rPr>
@@ -21344,7 +21344,7 @@
         <w:spacing w:before="0" w:after="0" w:line="240" w:lineRule="auto"/>
       </w:pPr>
       <w:rPr>
-        <w:rFonts w:asciiTheme="majorHAnsi" w:eastAsiaTheme="majorEastAsia" w:hAnsiTheme="majorHAnsi" w:cstheme="majorBidi"/>
+        <w:rFonts w:ascii="NanumGothic" w:hAnsi="NanumGothic" w:eastAsia="NanumGothic" w:cs="NanumGothic"/>
         <w:b/>
         <w:bCs/>
       </w:rPr>
@@ -21362,14 +21362,14 @@
     </w:tblStylePr>
     <w:tblStylePr w:type="firstCol">
       <w:rPr>
-        <w:rFonts w:asciiTheme="majorHAnsi" w:eastAsiaTheme="majorEastAsia" w:hAnsiTheme="majorHAnsi" w:cstheme="majorBidi"/>
+        <w:rFonts w:ascii="NanumGothic" w:hAnsi="NanumGothic" w:eastAsia="NanumGothic" w:cs="NanumGothic"/>
         <w:b/>
         <w:bCs/>
       </w:rPr>
     </w:tblStylePr>
     <w:tblStylePr w:type="lastCol">
       <w:rPr>
-        <w:rFonts w:asciiTheme="majorHAnsi" w:eastAsiaTheme="majorEastAsia" w:hAnsiTheme="majorHAnsi" w:cstheme="majorBidi"/>
+        <w:rFonts w:ascii="NanumGothic" w:hAnsi="NanumGothic" w:eastAsia="NanumGothic" w:cs="NanumGothic"/>
         <w:b/>
         <w:bCs/>
       </w:rPr>
@@ -21453,7 +21453,7 @@
         <w:spacing w:before="0" w:after="0" w:line="240" w:lineRule="auto"/>
       </w:pPr>
       <w:rPr>
-        <w:rFonts w:asciiTheme="majorHAnsi" w:eastAsiaTheme="majorEastAsia" w:hAnsiTheme="majorHAnsi" w:cstheme="majorBidi"/>
+        <w:rFonts w:ascii="NanumGothic" w:hAnsi="NanumGothic" w:eastAsia="NanumGothic" w:cs="NanumGothic"/>
         <w:b/>
         <w:bCs/>
       </w:rPr>
@@ -21474,7 +21474,7 @@
         <w:spacing w:before="0" w:after="0" w:line="240" w:lineRule="auto"/>
       </w:pPr>
       <w:rPr>
-        <w:rFonts w:asciiTheme="majorHAnsi" w:eastAsiaTheme="majorEastAsia" w:hAnsiTheme="majorHAnsi" w:cstheme="majorBidi"/>
+        <w:rFonts w:ascii="NanumGothic" w:hAnsi="NanumGothic" w:eastAsia="NanumGothic" w:cs="NanumGothic"/>
         <w:b/>
         <w:bCs/>
       </w:rPr>
@@ -21492,14 +21492,14 @@
     </w:tblStylePr>
     <w:tblStylePr w:type="firstCol">
       <w:rPr>
-        <w:rFonts w:asciiTheme="majorHAnsi" w:eastAsiaTheme="majorEastAsia" w:hAnsiTheme="majorHAnsi" w:cstheme="majorBidi"/>
+        <w:rFonts w:ascii="NanumGothic" w:hAnsi="NanumGothic" w:eastAsia="NanumGothic" w:cs="NanumGothic"/>
         <w:b/>
         <w:bCs/>
       </w:rPr>
     </w:tblStylePr>
     <w:tblStylePr w:type="lastCol">
       <w:rPr>
-        <w:rFonts w:asciiTheme="majorHAnsi" w:eastAsiaTheme="majorEastAsia" w:hAnsiTheme="majorHAnsi" w:cstheme="majorBidi"/>
+        <w:rFonts w:ascii="NanumGothic" w:hAnsi="NanumGothic" w:eastAsia="NanumGothic" w:cs="NanumGothic"/>
         <w:b/>
         <w:bCs/>
       </w:rPr>
@@ -21583,7 +21583,7 @@
         <w:spacing w:before="0" w:after="0" w:line="240" w:lineRule="auto"/>
       </w:pPr>
       <w:rPr>
-        <w:rFonts w:asciiTheme="majorHAnsi" w:eastAsiaTheme="majorEastAsia" w:hAnsiTheme="majorHAnsi" w:cstheme="majorBidi"/>
+        <w:rFonts w:ascii="NanumGothic" w:hAnsi="NanumGothic" w:eastAsia="NanumGothic" w:cs="NanumGothic"/>
         <w:b/>
         <w:bCs/>
       </w:rPr>
@@ -21604,7 +21604,7 @@
         <w:spacing w:before="0" w:after="0" w:line="240" w:lineRule="auto"/>
       </w:pPr>
       <w:rPr>
-        <w:rFonts w:asciiTheme="majorHAnsi" w:eastAsiaTheme="majorEastAsia" w:hAnsiTheme="majorHAnsi" w:cstheme="majorBidi"/>
+        <w:rFonts w:ascii="NanumGothic" w:hAnsi="NanumGothic" w:eastAsia="NanumGothic" w:cs="NanumGothic"/>
         <w:b/>
         <w:bCs/>
       </w:rPr>
@@ -21622,14 +21622,14 @@
     </w:tblStylePr>
     <w:tblStylePr w:type="firstCol">
       <w:rPr>
-        <w:rFonts w:asciiTheme="majorHAnsi" w:eastAsiaTheme="majorEastAsia" w:hAnsiTheme="majorHAnsi" w:cstheme="majorBidi"/>
+        <w:rFonts w:ascii="NanumGothic" w:hAnsi="NanumGothic" w:eastAsia="NanumGothic" w:cs="NanumGothic"/>
         <w:b/>
         <w:bCs/>
       </w:rPr>
     </w:tblStylePr>
     <w:tblStylePr w:type="lastCol">
       <w:rPr>
-        <w:rFonts w:asciiTheme="majorHAnsi" w:eastAsiaTheme="majorEastAsia" w:hAnsiTheme="majorHAnsi" w:cstheme="majorBidi"/>
+        <w:rFonts w:ascii="NanumGothic" w:hAnsi="NanumGothic" w:eastAsia="NanumGothic" w:cs="NanumGothic"/>
         <w:b/>
         <w:bCs/>
       </w:rPr>
@@ -21713,7 +21713,7 @@
         <w:spacing w:before="0" w:after="0" w:line="240" w:lineRule="auto"/>
       </w:pPr>
       <w:rPr>
-        <w:rFonts w:asciiTheme="majorHAnsi" w:eastAsiaTheme="majorEastAsia" w:hAnsiTheme="majorHAnsi" w:cstheme="majorBidi"/>
+        <w:rFonts w:ascii="NanumGothic" w:hAnsi="NanumGothic" w:eastAsia="NanumGothic" w:cs="NanumGothic"/>
         <w:b/>
         <w:bCs/>
       </w:rPr>
@@ -21734,7 +21734,7 @@
         <w:spacing w:before="0" w:after="0" w:line="240" w:lineRule="auto"/>
       </w:pPr>
       <w:rPr>
-        <w:rFonts w:asciiTheme="majorHAnsi" w:eastAsiaTheme="majorEastAsia" w:hAnsiTheme="majorHAnsi" w:cstheme="majorBidi"/>
+        <w:rFonts w:ascii="NanumGothic" w:hAnsi="NanumGothic" w:eastAsia="NanumGothic" w:cs="NanumGothic"/>
         <w:b/>
         <w:bCs/>
       </w:rPr>
@@ -21752,14 +21752,14 @@
     </w:tblStylePr>
     <w:tblStylePr w:type="firstCol">
       <w:rPr>
-        <w:rFonts w:asciiTheme="majorHAnsi" w:eastAsiaTheme="majorEastAsia" w:hAnsiTheme="majorHAnsi" w:cstheme="majorBidi"/>
+        <w:rFonts w:ascii="NanumGothic" w:hAnsi="NanumGothic" w:eastAsia="NanumGothic" w:cs="NanumGothic"/>
         <w:b/>
         <w:bCs/>
       </w:rPr>
     </w:tblStylePr>
     <w:tblStylePr w:type="lastCol">
       <w:rPr>
-        <w:rFonts w:asciiTheme="majorHAnsi" w:eastAsiaTheme="majorEastAsia" w:hAnsiTheme="majorHAnsi" w:cstheme="majorBidi"/>
+        <w:rFonts w:ascii="NanumGothic" w:hAnsi="NanumGothic" w:eastAsia="NanumGothic" w:cs="NanumGothic"/>
         <w:b/>
         <w:bCs/>
       </w:rPr>
@@ -21843,7 +21843,7 @@
         <w:spacing w:before="0" w:after="0" w:line="240" w:lineRule="auto"/>
       </w:pPr>
       <w:rPr>
-        <w:rFonts w:asciiTheme="majorHAnsi" w:eastAsiaTheme="majorEastAsia" w:hAnsiTheme="majorHAnsi" w:cstheme="majorBidi"/>
+        <w:rFonts w:ascii="NanumGothic" w:hAnsi="NanumGothic" w:eastAsia="NanumGothic" w:cs="NanumGothic"/>
         <w:b/>
         <w:bCs/>
       </w:rPr>
@@ -21864,7 +21864,7 @@
         <w:spacing w:before="0" w:after="0" w:line="240" w:lineRule="auto"/>
       </w:pPr>
       <w:rPr>
-        <w:rFonts w:asciiTheme="majorHAnsi" w:eastAsiaTheme="majorEastAsia" w:hAnsiTheme="majorHAnsi" w:cstheme="majorBidi"/>
+        <w:rFonts w:ascii="NanumGothic" w:hAnsi="NanumGothic" w:eastAsia="NanumGothic" w:cs="NanumGothic"/>
         <w:b/>
         <w:bCs/>
       </w:rPr>
@@ -21882,14 +21882,14 @@
     </w:tblStylePr>
     <w:tblStylePr w:type="firstCol">
       <w:rPr>
-        <w:rFonts w:asciiTheme="majorHAnsi" w:eastAsiaTheme="majorEastAsia" w:hAnsiTheme="majorHAnsi" w:cstheme="majorBidi"/>
+        <w:rFonts w:ascii="NanumGothic" w:hAnsi="NanumGothic" w:eastAsia="NanumGothic" w:cs="NanumGothic"/>
         <w:b/>
         <w:bCs/>
       </w:rPr>
     </w:tblStylePr>
     <w:tblStylePr w:type="lastCol">
       <w:rPr>
-        <w:rFonts w:asciiTheme="majorHAnsi" w:eastAsiaTheme="majorEastAsia" w:hAnsiTheme="majorHAnsi" w:cstheme="majorBidi"/>
+        <w:rFonts w:ascii="NanumGothic" w:hAnsi="NanumGothic" w:eastAsia="NanumGothic" w:cs="NanumGothic"/>
         <w:b/>
         <w:bCs/>
       </w:rPr>
@@ -23754,7 +23754,7 @@
     </w:tblPr>
     <w:tblStylePr w:type="firstRow">
       <w:rPr>
-        <w:rFonts w:asciiTheme="majorHAnsi" w:eastAsiaTheme="majorEastAsia" w:hAnsiTheme="majorHAnsi" w:cstheme="majorBidi"/>
+        <w:rFonts w:ascii="NanumGothic" w:hAnsi="NanumGothic" w:eastAsia="NanumGothic" w:cs="NanumGothic"/>
       </w:rPr>
       <w:tblPr/>
       <w:tcPr>
@@ -23838,7 +23838,7 @@
     </w:tblPr>
     <w:tblStylePr w:type="firstRow">
       <w:rPr>
-        <w:rFonts w:asciiTheme="majorHAnsi" w:eastAsiaTheme="majorEastAsia" w:hAnsiTheme="majorHAnsi" w:cstheme="majorBidi"/>
+        <w:rFonts w:ascii="NanumGothic" w:hAnsi="NanumGothic" w:eastAsia="NanumGothic" w:cs="NanumGothic"/>
       </w:rPr>
       <w:tblPr/>
       <w:tcPr>
@@ -23922,7 +23922,7 @@
     </w:tblPr>
     <w:tblStylePr w:type="firstRow">
       <w:rPr>
-        <w:rFonts w:asciiTheme="majorHAnsi" w:eastAsiaTheme="majorEastAsia" w:hAnsiTheme="majorHAnsi" w:cstheme="majorBidi"/>
+        <w:rFonts w:ascii="NanumGothic" w:hAnsi="NanumGothic" w:eastAsia="NanumGothic" w:cs="NanumGothic"/>
       </w:rPr>
       <w:tblPr/>
       <w:tcPr>
@@ -24006,7 +24006,7 @@
     </w:tblPr>
     <w:tblStylePr w:type="firstRow">
       <w:rPr>
-        <w:rFonts w:asciiTheme="majorHAnsi" w:eastAsiaTheme="majorEastAsia" w:hAnsiTheme="majorHAnsi" w:cstheme="majorBidi"/>
+        <w:rFonts w:ascii="NanumGothic" w:hAnsi="NanumGothic" w:eastAsia="NanumGothic" w:cs="NanumGothic"/>
       </w:rPr>
       <w:tblPr/>
       <w:tcPr>
@@ -24090,7 +24090,7 @@
     </w:tblPr>
     <w:tblStylePr w:type="firstRow">
       <w:rPr>
-        <w:rFonts w:asciiTheme="majorHAnsi" w:eastAsiaTheme="majorEastAsia" w:hAnsiTheme="majorHAnsi" w:cstheme="majorBidi"/>
+        <w:rFonts w:ascii="NanumGothic" w:hAnsi="NanumGothic" w:eastAsia="NanumGothic" w:cs="NanumGothic"/>
       </w:rPr>
       <w:tblPr/>
       <w:tcPr>
@@ -24174,7 +24174,7 @@
     </w:tblPr>
     <w:tblStylePr w:type="firstRow">
       <w:rPr>
-        <w:rFonts w:asciiTheme="majorHAnsi" w:eastAsiaTheme="majorEastAsia" w:hAnsiTheme="majorHAnsi" w:cstheme="majorBidi"/>
+        <w:rFonts w:ascii="NanumGothic" w:hAnsi="NanumGothic" w:eastAsia="NanumGothic" w:cs="NanumGothic"/>
       </w:rPr>
       <w:tblPr/>
       <w:tcPr>
@@ -24258,7 +24258,7 @@
     </w:tblPr>
     <w:tblStylePr w:type="firstRow">
       <w:rPr>
-        <w:rFonts w:asciiTheme="majorHAnsi" w:eastAsiaTheme="majorEastAsia" w:hAnsiTheme="majorHAnsi" w:cstheme="majorBidi"/>
+        <w:rFonts w:ascii="NanumGothic" w:hAnsi="NanumGothic" w:eastAsia="NanumGothic" w:cs="NanumGothic"/>
       </w:rPr>
       <w:tblPr/>
       <w:tcPr>
@@ -24323,7 +24323,7 @@
       <w:spacing w:after="0" w:line="240" w:lineRule="auto"/>
     </w:pPr>
     <w:rPr>
-      <w:rFonts w:asciiTheme="majorHAnsi" w:eastAsiaTheme="majorEastAsia" w:hAnsiTheme="majorHAnsi" w:cstheme="majorBidi"/>
+      <w:rFonts w:ascii="NanumGothic" w:hAnsi="NanumGothic" w:eastAsia="NanumGothic" w:cs="NanumGothic"/>
       <w:color w:val="000000" w:themeColor="text1"/>
     </w:rPr>
     <w:tblPr>
@@ -24451,7 +24451,7 @@
       <w:spacing w:after="0" w:line="240" w:lineRule="auto"/>
     </w:pPr>
     <w:rPr>
-      <w:rFonts w:asciiTheme="majorHAnsi" w:eastAsiaTheme="majorEastAsia" w:hAnsiTheme="majorHAnsi" w:cstheme="majorBidi"/>
+      <w:rFonts w:ascii="NanumGothic" w:hAnsi="NanumGothic" w:eastAsia="NanumGothic" w:cs="NanumGothic"/>
       <w:color w:val="000000" w:themeColor="text1"/>
     </w:rPr>
     <w:tblPr>
@@ -24579,7 +24579,7 @@
       <w:spacing w:after="0" w:line="240" w:lineRule="auto"/>
     </w:pPr>
     <w:rPr>
-      <w:rFonts w:asciiTheme="majorHAnsi" w:eastAsiaTheme="majorEastAsia" w:hAnsiTheme="majorHAnsi" w:cstheme="majorBidi"/>
+      <w:rFonts w:ascii="NanumGothic" w:hAnsi="NanumGothic" w:eastAsia="NanumGothic" w:cs="NanumGothic"/>
       <w:color w:val="000000" w:themeColor="text1"/>
     </w:rPr>
     <w:tblPr>
@@ -24707,7 +24707,7 @@
       <w:spacing w:after="0" w:line="240" w:lineRule="auto"/>
     </w:pPr>
     <w:rPr>
-      <w:rFonts w:asciiTheme="majorHAnsi" w:eastAsiaTheme="majorEastAsia" w:hAnsiTheme="majorHAnsi" w:cstheme="majorBidi"/>
+      <w:rFonts w:ascii="NanumGothic" w:hAnsi="NanumGothic" w:eastAsia="NanumGothic" w:cs="NanumGothic"/>
       <w:color w:val="000000" w:themeColor="text1"/>
     </w:rPr>
     <w:tblPr>
@@ -24835,7 +24835,7 @@
       <w:spacing w:after="0" w:line="240" w:lineRule="auto"/>
     </w:pPr>
     <w:rPr>
-      <w:rFonts w:asciiTheme="majorHAnsi" w:eastAsiaTheme="majorEastAsia" w:hAnsiTheme="majorHAnsi" w:cstheme="majorBidi"/>
+      <w:rFonts w:ascii="NanumGothic" w:hAnsi="NanumGothic" w:eastAsia="NanumGothic" w:cs="NanumGothic"/>
       <w:color w:val="000000" w:themeColor="text1"/>
     </w:rPr>
     <w:tblPr>
@@ -24963,7 +24963,7 @@
       <w:spacing w:after="0" w:line="240" w:lineRule="auto"/>
     </w:pPr>
     <w:rPr>
-      <w:rFonts w:asciiTheme="majorHAnsi" w:eastAsiaTheme="majorEastAsia" w:hAnsiTheme="majorHAnsi" w:cstheme="majorBidi"/>
+      <w:rFonts w:ascii="NanumGothic" w:hAnsi="NanumGothic" w:eastAsia="NanumGothic" w:cs="NanumGothic"/>
       <w:color w:val="000000" w:themeColor="text1"/>
     </w:rPr>
     <w:tblPr>
@@ -25091,7 +25091,7 @@
       <w:spacing w:after="0" w:line="240" w:lineRule="auto"/>
     </w:pPr>
     <w:rPr>
-      <w:rFonts w:asciiTheme="majorHAnsi" w:eastAsiaTheme="majorEastAsia" w:hAnsiTheme="majorHAnsi" w:cstheme="majorBidi"/>
+      <w:rFonts w:ascii="NanumGothic" w:hAnsi="NanumGothic" w:eastAsia="NanumGothic" w:cs="NanumGothic"/>
       <w:color w:val="000000" w:themeColor="text1"/>
     </w:rPr>
     <w:tblPr>
@@ -25730,7 +25730,7 @@
       <w:spacing w:after="0" w:line="240" w:lineRule="auto"/>
     </w:pPr>
     <w:rPr>
-      <w:rFonts w:asciiTheme="majorHAnsi" w:eastAsiaTheme="majorEastAsia" w:hAnsiTheme="majorHAnsi" w:cstheme="majorBidi"/>
+      <w:rFonts w:ascii="NanumGothic" w:hAnsi="NanumGothic" w:eastAsia="NanumGothic" w:cs="NanumGothic"/>
       <w:color w:val="000000" w:themeColor="text1"/>
     </w:rPr>
     <w:tblPr>
@@ -25855,7 +25855,7 @@
       <w:spacing w:after="0" w:line="240" w:lineRule="auto"/>
     </w:pPr>
     <w:rPr>
-      <w:rFonts w:asciiTheme="majorHAnsi" w:eastAsiaTheme="majorEastAsia" w:hAnsiTheme="majorHAnsi" w:cstheme="majorBidi"/>
+      <w:rFonts w:ascii="NanumGothic" w:hAnsi="NanumGothic" w:eastAsia="NanumGothic" w:cs="NanumGothic"/>
       <w:color w:val="000000" w:themeColor="text1"/>
     </w:rPr>
     <w:tblPr>
@@ -25980,7 +25980,7 @@
       <w:spacing w:after="0" w:line="240" w:lineRule="auto"/>
     </w:pPr>
     <w:rPr>
-      <w:rFonts w:asciiTheme="majorHAnsi" w:eastAsiaTheme="majorEastAsia" w:hAnsiTheme="majorHAnsi" w:cstheme="majorBidi"/>
+      <w:rFonts w:ascii="NanumGothic" w:hAnsi="NanumGothic" w:eastAsia="NanumGothic" w:cs="NanumGothic"/>
       <w:color w:val="000000" w:themeColor="text1"/>
     </w:rPr>
     <w:tblPr>
@@ -26105,7 +26105,7 @@
       <w:spacing w:after="0" w:line="240" w:lineRule="auto"/>
     </w:pPr>
     <w:rPr>
-      <w:rFonts w:asciiTheme="majorHAnsi" w:eastAsiaTheme="majorEastAsia" w:hAnsiTheme="majorHAnsi" w:cstheme="majorBidi"/>
+      <w:rFonts w:ascii="NanumGothic" w:hAnsi="NanumGothic" w:eastAsia="NanumGothic" w:cs="NanumGothic"/>
       <w:color w:val="000000" w:themeColor="text1"/>
     </w:rPr>
     <w:tblPr>
@@ -26230,7 +26230,7 @@
       <w:spacing w:after="0" w:line="240" w:lineRule="auto"/>
     </w:pPr>
     <w:rPr>
-      <w:rFonts w:asciiTheme="majorHAnsi" w:eastAsiaTheme="majorEastAsia" w:hAnsiTheme="majorHAnsi" w:cstheme="majorBidi"/>
+      <w:rFonts w:ascii="NanumGothic" w:hAnsi="NanumGothic" w:eastAsia="NanumGothic" w:cs="NanumGothic"/>
       <w:color w:val="000000" w:themeColor="text1"/>
     </w:rPr>
     <w:tblPr>
@@ -26355,7 +26355,7 @@
       <w:spacing w:after="0" w:line="240" w:lineRule="auto"/>
     </w:pPr>
     <w:rPr>
-      <w:rFonts w:asciiTheme="majorHAnsi" w:eastAsiaTheme="majorEastAsia" w:hAnsiTheme="majorHAnsi" w:cstheme="majorBidi"/>
+      <w:rFonts w:ascii="NanumGothic" w:hAnsi="NanumGothic" w:eastAsia="NanumGothic" w:cs="NanumGothic"/>
       <w:color w:val="000000" w:themeColor="text1"/>
     </w:rPr>
     <w:tblPr>
@@ -26480,7 +26480,7 @@
       <w:spacing w:after="0" w:line="240" w:lineRule="auto"/>
     </w:pPr>
     <w:rPr>
-      <w:rFonts w:asciiTheme="majorHAnsi" w:eastAsiaTheme="majorEastAsia" w:hAnsiTheme="majorHAnsi" w:cstheme="majorBidi"/>
+      <w:rFonts w:ascii="NanumGothic" w:hAnsi="NanumGothic" w:eastAsia="NanumGothic" w:cs="NanumGothic"/>
       <w:color w:val="000000" w:themeColor="text1"/>
     </w:rPr>
     <w:tblPr>

</xml_diff>